<commit_message>
Release v0.4.5 — CTUNE rebuild + Waterfall ID + CW macros
Version bump (CMake + installer) to 0.4.5, release note, and SESSION_LOG
refresh for the v0.4.5 release.

Shipped in this version (already committed on the branch):
- #176 CW macros: named click/F-key memories + contact-row + personal
  tokens + click-to-insert (9f0d054)
- #175 Waterfall callsign ID + LSB mirror fix (79d8d43)
- #174 CTUNE centre-tune edge model rebuilt to reference parity (29acc6d)
- Settings dialog per-tab scroll + larger default size

Co-Authored-By: Claude Opus 4.8 (1M context) <noreply@anthropic.com>
</commit_message>
<xml_diff>
--- a/docs/SESSION_LOG.docx
+++ b/docs/SESSION_LOG.docx
@@ -13,6 +13,372 @@
     <w:p>
       <w:r>
         <w:t>Running EOD log. Newest entry on top. Short rough-outline format.</w:t>
+      </w:r>
+    </w:p>
+    <w:p>
+      <w:pPr>
+        <w:pBdr>
+          <w:bottom w:val="single" w:sz="6" w:color="808080"/>
+        </w:pBdr>
+      </w:pPr>
+    </w:p>
+    <w:p>
+      <w:pPr>
+        <w:pStyle w:val="Heading2"/>
+      </w:pPr>
+      <w:r>
+        <w:t>2026-06-22 — v0.4.5 RELEASED: CTUNE rebuild + Waterfall ID + CW macros</w:t>
+      </w:r>
+    </w:p>
+    <w:p>
+      <w:r>
+        <w:t xml:space="preserve">Branch </w:t>
+      </w:r>
+      <w:r>
+        <w:rPr>
+          <w:rFonts w:ascii="Consolas" w:hAnsi="Consolas"/>
+          <w:sz w:val="18"/>
+        </w:rPr>
+        <w:t>feature/ctune-rebuild-wfid</w:t>
+      </w:r>
+      <w:r>
+        <w:t xml:space="preserve">; </w:t>
+      </w:r>
+      <w:r>
+        <w:rPr>
+          <w:rFonts w:ascii="Consolas" w:hAnsi="Consolas"/>
+          <w:sz w:val="18"/>
+        </w:rPr>
+        <w:t>main</w:t>
+      </w:r>
+      <w:r>
+        <w:t xml:space="preserve"> was at v0.4.4. This is the v0.4.5 release.</w:t>
+      </w:r>
+    </w:p>
+    <w:p>
+      <w:pPr>
+        <w:pStyle w:val="Heading3"/>
+      </w:pPr>
+      <w:r>
+        <w:t>#174 CTUNE rebuilt (operator: v0.4.4 "built wrong")</w:t>
+      </w:r>
+    </w:p>
+    <w:p>
+      <w:pPr>
+        <w:pStyle w:val="ListBullet"/>
+        <w:ind w:left="360"/>
+      </w:pPr>
+      <w:r>
+        <w:t>4-agent Thetis-vs-Lyra audit. Centre/shift/edge decision relocated from QML</w:t>
+      </w:r>
+    </w:p>
+    <w:p>
+      <w:r>
+        <w:t>into the C++ RX-NCO chokepoint (</w:t>
+      </w:r>
+      <w:r>
+        <w:rPr>
+          <w:rFonts w:ascii="Consolas" w:hAnsi="Consolas"/>
+          <w:sz w:val="18"/>
+        </w:rPr>
+        <w:t>HL2Stream::pushEffectiveRxFreq</w:t>
+      </w:r>
+      <w:r>
+        <w:t xml:space="preserve">) so EVERY tune source behaves (dial / click / keypad / band+memory / TCI spot): smooth- scroll at the 5% display margin, far-jump re-centre, zoom force-centre, IQ- Nyquist clamp. </w:t>
+      </w:r>
+      <w:r>
+        <w:rPr>
+          <w:rFonts w:ascii="Consolas" w:hAnsi="Consolas"/>
+          <w:sz w:val="18"/>
+        </w:rPr>
+        <w:t>RXANBPSetShiftFrequency</w:t>
+      </w:r>
+      <w:r>
+        <w:t xml:space="preserve"> added so notches/NB track the shift.</w:t>
+      </w:r>
+    </w:p>
+    <w:p>
+      <w:pPr>
+        <w:pStyle w:val="ListBullet"/>
+        <w:ind w:left="360"/>
+      </w:pPr>
+      <w:r>
+        <w:t xml:space="preserve">Commit </w:t>
+      </w:r>
+      <w:r>
+        <w:rPr>
+          <w:rFonts w:ascii="Consolas" w:hAnsi="Consolas"/>
+          <w:sz w:val="18"/>
+        </w:rPr>
+        <w:t>29acc6d</w:t>
+      </w:r>
+      <w:r>
+        <w:t xml:space="preserve"> (design docs </w:t>
+      </w:r>
+      <w:r>
+        <w:rPr>
+          <w:rFonts w:ascii="Consolas" w:hAnsi="Consolas"/>
+          <w:sz w:val="18"/>
+        </w:rPr>
+        <w:t>0e0f2f2</w:t>
+      </w:r>
+      <w:r>
+        <w:t>).</w:t>
+      </w:r>
+    </w:p>
+    <w:p>
+      <w:pPr>
+        <w:pStyle w:val="Heading3"/>
+      </w:pPr>
+      <w:r>
+        <w:t>#175 Waterfall callsign ID</w:t>
+      </w:r>
+    </w:p>
+    <w:p>
+      <w:pPr>
+        <w:pStyle w:val="ListBullet"/>
+        <w:ind w:left="360"/>
+      </w:pPr>
+      <w:r>
+        <w:t>TX courtesy ID: the call rendered as a readable image in the SSB passband.</w:t>
+      </w:r>
+    </w:p>
+    <w:p>
+      <w:r>
+        <w:t>Header arm chip (USB/LSB only), Settings → TX config (level ≤0.065 / repeat / over-drive warning), crash-safe transient flat-TX orchestrator (TCI source + whole-rack bypass + DIGU/DIGL, restore on un-key).</w:t>
+      </w:r>
+    </w:p>
+    <w:p>
+      <w:pPr>
+        <w:pStyle w:val="ListBullet"/>
+        <w:ind w:left="360"/>
+      </w:pPr>
+      <w:r>
+        <w:rPr>
+          <w:b/>
+        </w:rPr>
+        <w:t>LSB mirror bug fixed</w:t>
+      </w:r>
+      <w:r>
+        <w:t xml:space="preserve"> this session: DIGL flips audio↔RF, so the call came</w:t>
+      </w:r>
+    </w:p>
+    <w:p>
+      <w:r>
+        <w:t xml:space="preserve">out mirrored in LSB (USB was fine). Renderer now pre-mirrors the frequency layout for LSB → reads upright on both sidebands. Commit </w:t>
+      </w:r>
+      <w:r>
+        <w:rPr>
+          <w:rFonts w:ascii="Consolas" w:hAnsi="Consolas"/>
+          <w:sz w:val="18"/>
+        </w:rPr>
+        <w:t>79d8d43</w:t>
+      </w:r>
+      <w:r>
+        <w:t>.</w:t>
+      </w:r>
+    </w:p>
+    <w:p>
+      <w:pPr>
+        <w:pStyle w:val="Heading3"/>
+      </w:pPr>
+      <w:r>
+        <w:t>#176 CW macros — named click / F-key memories</w:t>
+      </w:r>
+    </w:p>
+    <w:p>
+      <w:pPr>
+        <w:pStyle w:val="ListBullet"/>
+        <w:ind w:left="360"/>
+      </w:pPr>
+      <w:r>
+        <w:t>Redesigned floating CW console into a contest-grade macro bank: named click +</w:t>
+      </w:r>
+    </w:p>
+    <w:p>
+      <w:r>
+        <w:t>F-key (F1–F12, global) memories, a "My macros" group the operator builds out, live "sending" state, Repeat, a contact row (His call / Name / RST / #).</w:t>
+      </w:r>
+    </w:p>
+    <w:p>
+      <w:pPr>
+        <w:pStyle w:val="ListBullet"/>
+        <w:ind w:left="360"/>
+      </w:pPr>
+      <w:r>
+        <w:t xml:space="preserve">Tokens: contact </w:t>
+      </w:r>
+      <w:r>
+        <w:rPr>
+          <w:rFonts w:ascii="Consolas" w:hAnsi="Consolas"/>
+          <w:sz w:val="18"/>
+        </w:rPr>
+        <w:t>{CALL}/{NAME}/{RST}/{#}</w:t>
+      </w:r>
+      <w:r>
+        <w:t xml:space="preserve"> + </w:t>
+      </w:r>
+      <w:r>
+        <w:rPr>
+          <w:rFonts w:ascii="Consolas" w:hAnsi="Consolas"/>
+          <w:sz w:val="18"/>
+        </w:rPr>
+        <w:t>{MYCALL}</w:t>
+      </w:r>
+      <w:r>
+        <w:t>, plus operator personal</w:t>
+      </w:r>
+    </w:p>
+    <w:p>
+      <w:r>
+        <w:t>tokens (</w:t>
+      </w:r>
+      <w:r>
+        <w:rPr>
+          <w:rFonts w:ascii="Consolas" w:hAnsi="Consolas"/>
+          <w:sz w:val="18"/>
+        </w:rPr>
+        <w:t>{ME}/{PWR}/{QTH}/{RIG}/...</w:t>
+      </w:r>
+      <w:r>
+        <w:t>), with a click-to-insert palette.</w:t>
+      </w:r>
+    </w:p>
+    <w:p>
+      <w:pPr>
+        <w:pStyle w:val="ListBullet"/>
+        <w:ind w:left="360"/>
+      </w:pPr>
+      <w:r>
+        <w:t xml:space="preserve">New </w:t>
+      </w:r>
+      <w:r>
+        <w:rPr>
+          <w:rFonts w:ascii="Consolas" w:hAnsi="Consolas"/>
+          <w:sz w:val="18"/>
+        </w:rPr>
+        <w:t>CwMacroModel</w:t>
+      </w:r>
+      <w:r>
+        <w:t xml:space="preserve"> persists macros / tokens / serial to QSettings. F-keys via</w:t>
+      </w:r>
+    </w:p>
+    <w:p>
+      <w:r>
+        <w:rPr>
+          <w:rFonts w:ascii="Consolas" w:hAnsi="Consolas"/>
+          <w:sz w:val="18"/>
+        </w:rPr>
+        <w:t>MainWindow::keyPressEvent</w:t>
+      </w:r>
+      <w:r>
+        <w:t xml:space="preserve"> (QML Shortcuts don't fire in the QQuickWidget docks). Commit </w:t>
+      </w:r>
+      <w:r>
+        <w:rPr>
+          <w:rFonts w:ascii="Consolas" w:hAnsi="Consolas"/>
+          <w:sz w:val="18"/>
+        </w:rPr>
+        <w:t>9f0d054</w:t>
+      </w:r>
+      <w:r>
+        <w:t>.</w:t>
+      </w:r>
+    </w:p>
+    <w:p>
+      <w:pPr>
+        <w:pStyle w:val="Heading3"/>
+      </w:pPr>
+      <w:r>
+        <w:t>Settings dialog</w:t>
+      </w:r>
+    </w:p>
+    <w:p>
+      <w:pPr>
+        <w:pStyle w:val="ListBullet"/>
+        <w:ind w:left="360"/>
+      </w:pPr>
+      <w:r>
+        <w:t>Per-tab scroll-area + larger default size (long tabs were clipping).</w:t>
+      </w:r>
+    </w:p>
+    <w:p>
+      <w:pPr>
+        <w:pStyle w:val="Heading3"/>
+      </w:pPr>
+      <w:r>
+        <w:t>Release</w:t>
+      </w:r>
+    </w:p>
+    <w:p>
+      <w:pPr>
+        <w:pStyle w:val="ListBullet"/>
+        <w:ind w:left="360"/>
+      </w:pPr>
+      <w:r>
+        <w:t>Version bumped (</w:t>
+      </w:r>
+      <w:r>
+        <w:rPr>
+          <w:rFonts w:ascii="Consolas" w:hAnsi="Consolas"/>
+          <w:sz w:val="18"/>
+        </w:rPr>
+        <w:t>CMakeLists.txt</w:t>
+      </w:r>
+      <w:r>
+        <w:t xml:space="preserve"> + </w:t>
+      </w:r>
+      <w:r>
+        <w:rPr>
+          <w:rFonts w:ascii="Consolas" w:hAnsi="Consolas"/>
+          <w:sz w:val="18"/>
+        </w:rPr>
+        <w:t>installer/lyra.iss</w:t>
+      </w:r>
+      <w:r>
+        <w:t xml:space="preserve"> → 0.4.5), release note</w:t>
+      </w:r>
+    </w:p>
+    <w:p>
+      <w:r>
+        <w:rPr>
+          <w:rFonts w:ascii="Consolas" w:hAnsi="Consolas"/>
+          <w:sz w:val="18"/>
+        </w:rPr>
+        <w:t>docs/releases/v0.4.5.md</w:t>
+      </w:r>
+      <w:r>
+        <w:t xml:space="preserve">, User Guide CW section updated, annotated tag </w:t>
+      </w:r>
+      <w:r>
+        <w:rPr>
+          <w:rFonts w:ascii="Consolas" w:hAnsi="Consolas"/>
+          <w:sz w:val="18"/>
+        </w:rPr>
+        <w:t>v0.4.5</w:t>
+      </w:r>
+      <w:r>
+        <w:t xml:space="preserve">, installer </w:t>
+      </w:r>
+      <w:r>
+        <w:rPr>
+          <w:rFonts w:ascii="Consolas" w:hAnsi="Consolas"/>
+          <w:sz w:val="18"/>
+        </w:rPr>
+        <w:t>dist/Lyra-Setup-0.4.5.exe</w:t>
+      </w:r>
+      <w:r>
+        <w:t xml:space="preserve">, pushed to GitHub; </w:t>
+      </w:r>
+      <w:r>
+        <w:rPr>
+          <w:rFonts w:ascii="Consolas" w:hAnsi="Consolas"/>
+          <w:sz w:val="18"/>
+        </w:rPr>
+        <w:t>main</w:t>
+      </w:r>
+      <w:r>
+        <w:t xml:space="preserve"> fast-forwarded to the release.</w:t>
       </w:r>
     </w:p>
     <w:p>
@@ -11169,7 +11535,7 @@
         <w:color w:val="808080"/>
         <w:sz w:val="16"/>
       </w:rPr>
-      <w:t>lyra-cpp — Session Log — auto-generated 2026-06-21 10:53 (source: SESSION_LOG.md)</w:t>
+      <w:t>lyra-cpp - Session Log — auto-generated 2026-06-22 18:48 (source: SESSION_LOG.md)</w:t>
     </w:r>
   </w:p>
 </w:hdr>

</xml_diff>

<commit_message>
docs: SESSION_LOG + THETIS_DIRECT_PORT_PLAN for v0.4.8 (+ regen DOCX/PDF)
SESSION_LOG 2026-06-24 entry: panel docking overhaul (#184), factory
default fix, CW transmit metering (#105), v0.4.8 release, GitHub wiki,
and the CW decoder accuracy review (analysis-only, A-slice chosen).
THETIS_DIRECT_PORT_PLAN SHIPPED-WORK LOG: the TX-relevant #105 CW
meter RX/TX-flip reconciliation. DOCX/PDF regenerated via
tools/sync_execution_plan.py.

Co-Authored-By: Claude Opus 4.8 (1M context) <noreply@anthropic.com>
</commit_message>
<xml_diff>
--- a/docs/SESSION_LOG.docx
+++ b/docs/SESSION_LOG.docx
@@ -21,6 +21,679 @@
           <w:bottom w:val="single" w:sz="6" w:color="808080"/>
         </w:pBdr>
       </w:pPr>
+    </w:p>
+    <w:p>
+      <w:pPr>
+        <w:pStyle w:val="Heading2"/>
+      </w:pPr>
+      <w:r>
+        <w:t>2026-06-24 — v0.4.8 RELEASED: panel docking overhaul + CW transmit metering (+ wiki, CW-decoder review)</w:t>
+      </w:r>
+    </w:p>
+    <w:p>
+      <w:r>
+        <w:t xml:space="preserve">Working on </w:t>
+      </w:r>
+      <w:r>
+        <w:rPr>
+          <w:rFonts w:ascii="Consolas" w:hAnsi="Consolas"/>
+          <w:sz w:val="18"/>
+        </w:rPr>
+        <w:t>main</w:t>
+      </w:r>
+      <w:r>
+        <w:t xml:space="preserve"> (last tag </w:t>
+      </w:r>
+      <w:r>
+        <w:rPr>
+          <w:rFonts w:ascii="Consolas" w:hAnsi="Consolas"/>
+          <w:sz w:val="18"/>
+        </w:rPr>
+        <w:t>v0.4.7</w:t>
+      </w:r>
+      <w:r>
+        <w:t xml:space="preserve"> = </w:t>
+      </w:r>
+      <w:r>
+        <w:rPr>
+          <w:rFonts w:ascii="Consolas" w:hAnsi="Consolas"/>
+          <w:sz w:val="18"/>
+        </w:rPr>
+        <w:t>ff6c9c9</w:t>
+      </w:r>
+      <w:r>
+        <w:t xml:space="preserve">). Tester feedback (Randy W7CPA / Jim / a 3rd) said the main panels "all float, nothing docks, drop-against-an-edge does nothing," and resizing was a fight. Big UI arc + a CW metering arc, shipped as </w:t>
+      </w:r>
+      <w:r>
+        <w:rPr>
+          <w:b/>
+        </w:rPr>
+        <w:t>v0.4.8</w:t>
+      </w:r>
+      <w:r>
+        <w:t>.</w:t>
+      </w:r>
+    </w:p>
+    <w:p>
+      <w:pPr>
+        <w:pStyle w:val="Heading3"/>
+      </w:pPr>
+      <w:r>
+        <w:t>Panel docking overhaul (#184) — `dockdragcontroller.{h,cpp}` (NEW) + `mainwindow.{h,cpp}`</w:t>
+      </w:r>
+    </w:p>
+    <w:p>
+      <w:pPr>
+        <w:pStyle w:val="ListBullet"/>
+        <w:ind w:left="360"/>
+      </w:pPr>
+      <w:r>
+        <w:t>Root cause: the custom dock title bar (</w:t>
+      </w:r>
+      <w:r>
+        <w:rPr>
+          <w:rFonts w:ascii="Consolas" w:hAnsi="Consolas"/>
+          <w:sz w:val="18"/>
+        </w:rPr>
+        <w:t>makeDockTitleBar</w:t>
+      </w:r>
+      <w:r>
+        <w:t>) replaces</w:t>
+      </w:r>
+    </w:p>
+    <w:p>
+      <w:r>
+        <w:t>QDockWidget's built-in drag, killing Qt's drag-&gt;drop-indicator-&gt;snap-to-edge.</w:t>
+      </w:r>
+    </w:p>
+    <w:p>
+      <w:pPr>
+        <w:pStyle w:val="ListBullet"/>
+        <w:ind w:left="360"/>
+      </w:pPr>
+      <w:r>
+        <w:t xml:space="preserve">New </w:t>
+      </w:r>
+      <w:r>
+        <w:rPr>
+          <w:rFonts w:ascii="Consolas" w:hAnsi="Consolas"/>
+          <w:sz w:val="18"/>
+        </w:rPr>
+        <w:t>DockDragController</w:t>
+      </w:r>
+      <w:r>
+        <w:t xml:space="preserve"> (public QMainWindow API only): press-&gt;threshold-&gt;</w:t>
+      </w:r>
+    </w:p>
+    <w:p>
+      <w:r>
+        <w:t xml:space="preserve">drag-&gt;drop FSM on each title bar, translucent </w:t>
+      </w:r>
+      <w:r>
+        <w:rPr>
+          <w:b/>
+        </w:rPr>
+        <w:t>cyan drop-zone overlay</w:t>
+      </w:r>
+      <w:r>
+        <w:t xml:space="preserve"> — snap-to-edge (</w:t>
+      </w:r>
+      <w:r>
+        <w:rPr>
+          <w:rFonts w:ascii="Consolas" w:hAnsi="Consolas"/>
+          <w:sz w:val="18"/>
+        </w:rPr>
+        <w:t>addDockWidget</w:t>
+      </w:r>
+      <w:r>
+        <w:t>), neighbor split L/R/T/B thirds (</w:t>
+      </w:r>
+      <w:r>
+        <w:rPr>
+          <w:rFonts w:ascii="Consolas" w:hAnsi="Consolas"/>
+          <w:sz w:val="18"/>
+        </w:rPr>
+        <w:t>splitDockWidget</w:t>
+      </w:r>
+      <w:r>
+        <w:t>, "before"=double-split), center tabify (</w:t>
+      </w:r>
+      <w:r>
+        <w:rPr>
+          <w:rFonts w:ascii="Consolas" w:hAnsi="Consolas"/>
+          <w:sz w:val="18"/>
+        </w:rPr>
+        <w:t>tabifyDockWidget</w:t>
+      </w:r>
+      <w:r>
+        <w:t>), off-region float (</w:t>
+      </w:r>
+      <w:r>
+        <w:rPr>
+          <w:rFonts w:ascii="Consolas" w:hAnsi="Consolas"/>
+          <w:sz w:val="18"/>
+        </w:rPr>
+        <w:t>setFloating</w:t>
+      </w:r>
+      <w:r>
+        <w:t>). Save-on-commit.</w:t>
+      </w:r>
+    </w:p>
+    <w:p>
+      <w:pPr>
+        <w:pStyle w:val="ListBullet"/>
+        <w:ind w:left="360"/>
+      </w:pPr>
+      <w:r>
+        <w:t>Resize: dock separators widened 6px + cyan-on-hover; tab bar styled.</w:t>
+      </w:r>
+    </w:p>
+    <w:p>
+      <w:r>
+        <w:t>Compact custom move cursor (arrow while locked). One-time status-bar hint.</w:t>
+      </w:r>
+    </w:p>
+    <w:p>
+      <w:pPr>
+        <w:pStyle w:val="ListBullet"/>
+        <w:ind w:left="360"/>
+      </w:pPr>
+      <w:r>
+        <w:rPr>
+          <w:b/>
+        </w:rPr>
+        <w:t>Lock = move + resize</w:t>
+      </w:r>
+      <w:r>
+        <w:t>: disables move/float/close via features AND blocks</w:t>
+      </w:r>
+    </w:p>
+    <w:p>
+      <w:r>
+        <w:t xml:space="preserve">the dock-separator resize press in </w:t>
+      </w:r>
+      <w:r>
+        <w:rPr>
+          <w:rFonts w:ascii="Consolas" w:hAnsi="Consolas"/>
+          <w:sz w:val="18"/>
+        </w:rPr>
+        <w:t>event()</w:t>
+      </w:r>
+      <w:r>
+        <w:t xml:space="preserve"> (split-cursor detect). The earlier </w:t>
+      </w:r>
+      <w:r>
+        <w:rPr>
+          <w:rFonts w:ascii="Consolas" w:hAnsi="Consolas"/>
+          <w:sz w:val="18"/>
+        </w:rPr>
+        <w:t>setFixedSize</w:t>
+      </w:r>
+      <w:r>
+        <w:t>-on-lock froze panels and collapsed the layout on a locked restart — REMOVED; event-interception locks resize cleanly and always restores. (Two intermediate restart-collapse symptoms chased + fixed.)</w:t>
+      </w:r>
+    </w:p>
+    <w:p>
+      <w:pPr>
+        <w:pStyle w:val="ListBullet"/>
+        <w:ind w:left="360"/>
+      </w:pPr>
+      <w:r>
+        <w:t xml:space="preserve">View -&gt; Layouts: </w:t>
+      </w:r>
+      <w:r>
+        <w:rPr>
+          <w:b/>
+        </w:rPr>
+        <w:t>4 named slots + Lyra default</w:t>
+      </w:r>
+      <w:r>
+        <w:t xml:space="preserve"> (recall no longer</w:t>
+      </w:r>
+    </w:p>
+    <w:p>
+      <w:r>
+        <w:t>force-shows the chip-summoned TX/RX/CW rack panels).</w:t>
+      </w:r>
+    </w:p>
+    <w:p>
+      <w:pPr>
+        <w:pStyle w:val="Heading3"/>
+      </w:pPr>
+      <w:r>
+        <w:t>Factory default fixed — `default_layout.h` + `applyDefaultLayout`</w:t>
+      </w:r>
+    </w:p>
+    <w:p>
+      <w:pPr>
+        <w:pStyle w:val="ListBullet"/>
+        <w:ind w:left="360"/>
+      </w:pPr>
+      <w:r>
+        <w:t>Prior embedded default was base64 of the raw registry REG_BINARY -&gt; carried</w:t>
+      </w:r>
+    </w:p>
+    <w:p>
+      <w:r>
+        <w:t xml:space="preserve">the QSettings </w:t>
+      </w:r>
+      <w:r>
+        <w:rPr>
+          <w:rFonts w:ascii="Consolas" w:hAnsi="Consolas"/>
+          <w:sz w:val="18"/>
+        </w:rPr>
+        <w:t>@ByteArray(...)</w:t>
+      </w:r>
+      <w:r>
+        <w:t xml:space="preserve"> UTF-16 wrapper -&gt; </w:t>
+      </w:r>
+      <w:r>
+        <w:rPr>
+          <w:rFonts w:ascii="Consolas" w:hAnsi="Consolas"/>
+          <w:sz w:val="18"/>
+        </w:rPr>
+        <w:t>restoreState()</w:t>
+      </w:r>
+      <w:r>
+        <w:t xml:space="preserve"> rejected it (the "screwed up default"). Re-embedded from operator's </w:t>
+      </w:r>
+      <w:r>
+        <w:rPr>
+          <w:b/>
+        </w:rPr>
+        <w:t>N8SDR</w:t>
+      </w:r>
+      <w:r>
+        <w:t xml:space="preserve"> slot, de-wrapped to the real saveState bytes, + </w:t>
+      </w:r>
+      <w:r>
+        <w:rPr>
+          <w:rFonts w:ascii="Consolas" w:hAnsi="Consolas"/>
+          <w:sz w:val="18"/>
+        </w:rPr>
+        <w:t>defaultPanadapterSplit()</w:t>
+      </w:r>
+      <w:r>
+        <w:t>.</w:t>
+      </w:r>
+    </w:p>
+    <w:p>
+      <w:pPr>
+        <w:pStyle w:val="Heading3"/>
+      </w:pPr>
+      <w:r>
+        <w:t>CW transmit metering (#105) — `hl2_stream.{h,cpp}`, `metermodel.{h,cpp}`, `main.cpp`, QML</w:t>
+      </w:r>
+    </w:p>
+    <w:p>
+      <w:pPr>
+        <w:pStyle w:val="ListBullet"/>
+        <w:ind w:left="360"/>
+      </w:pPr>
+      <w:r>
+        <w:t>Bug: QSK CW keys the PA at the gateware and deliberately leaves wire MOX</w:t>
+      </w:r>
+    </w:p>
+    <w:p>
+      <w:r>
+        <w:t xml:space="preserve">low, so the meter (gated on </w:t>
+      </w:r>
+      <w:r>
+        <w:rPr>
+          <w:rFonts w:ascii="Consolas" w:hAnsi="Consolas"/>
+          <w:sz w:val="18"/>
+        </w:rPr>
+        <w:t>moxActive</w:t>
+      </w:r>
+      <w:r>
+        <w:t>) never flipped to TX during CW (external watt-meter showed power). Other modes flip because they assert MOX.</w:t>
+      </w:r>
+    </w:p>
+    <w:p>
+      <w:pPr>
+        <w:pStyle w:val="ListBullet"/>
+        <w:ind w:left="360"/>
+      </w:pPr>
+      <w:r>
+        <w:rPr>
+          <w:rFonts w:ascii="Consolas" w:hAnsi="Consolas"/>
+          <w:sz w:val="18"/>
+        </w:rPr>
+        <w:t>cwKeyingActive</w:t>
+      </w:r>
+      <w:r>
+        <w:t xml:space="preserve"> (message-level, from the CwKeyer </w:t>
+      </w:r>
+      <w:r>
+        <w:rPr>
+          <w:rFonts w:ascii="Consolas" w:hAnsi="Consolas"/>
+          <w:sz w:val="18"/>
+        </w:rPr>
+        <w:t>onState</w:t>
+      </w:r>
+      <w:r>
+        <w:t xml:space="preserve"> hook, marshalled</w:t>
+      </w:r>
+    </w:p>
+    <w:p>
+      <w:r>
+        <w:t xml:space="preserve">to the stream thread) drives the meter RX&lt;-&gt;TX swap + the Ladder source set. Reads </w:t>
+      </w:r>
+      <w:r>
+        <w:rPr>
+          <w:rFonts w:ascii="Consolas" w:hAnsi="Consolas"/>
+          <w:sz w:val="18"/>
+        </w:rPr>
+        <w:t>fwdPowerW()</w:t>
+      </w:r>
+      <w:r>
+        <w:t xml:space="preserve"> (already valid during gateware CW). Does NOT assert wire MOX — QSK keying unchanged.</w:t>
+      </w:r>
+    </w:p>
+    <w:p>
+      <w:pPr>
+        <w:pStyle w:val="ListBullet"/>
+        <w:ind w:left="360"/>
+      </w:pPr>
+      <w:r>
+        <w:rPr>
+          <w:rFonts w:ascii="Consolas" w:hAnsi="Consolas"/>
+          <w:sz w:val="18"/>
+        </w:rPr>
+        <w:t>txDisplayActive</w:t>
+      </w:r>
+      <w:r>
+        <w:t xml:space="preserve"> (= </w:t>
+      </w:r>
+      <w:r>
+        <w:rPr>
+          <w:rFonts w:ascii="Consolas" w:hAnsi="Consolas"/>
+          <w:sz w:val="18"/>
+        </w:rPr>
+        <w:t>moxActive || cwKeyingActive</w:t>
+      </w:r>
+      <w:r>
+        <w:t xml:space="preserve">) drives the </w:t>
+      </w:r>
+      <w:r>
+        <w:rPr>
+          <w:b/>
+        </w:rPr>
+        <w:t>red-on-air</w:t>
+      </w:r>
+    </w:p>
+    <w:p>
+      <w:r>
+        <w:t>QML (VFO border + RX/TX tag in TuningPanel, split/XIT TX markers in PanadapterPanel).</w:t>
+      </w:r>
+    </w:p>
+    <w:p>
+      <w:pPr>
+        <w:pStyle w:val="ListBullet"/>
+        <w:ind w:left="360"/>
+      </w:pPr>
+      <w:r>
+        <w:rPr>
+          <w:b/>
+        </w:rPr>
+        <w:t>Paddle/key</w:t>
+      </w:r>
+      <w:r>
+        <w:t xml:space="preserve"> detection: </w:t>
+      </w:r>
+      <w:r>
+        <w:rPr>
+          <w:rFonts w:ascii="Consolas" w:hAnsi="Consolas"/>
+          <w:sz w:val="18"/>
+        </w:rPr>
+        <w:t>onHwPttPoll</w:t>
+      </w:r>
+      <w:r>
+        <w:t xml:space="preserve"> (~50 ms) latches </w:t>
+      </w:r>
+      <w:r>
+        <w:rPr>
+          <w:rFonts w:ascii="Consolas" w:hAnsi="Consolas"/>
+          <w:sz w:val="18"/>
+        </w:rPr>
+        <w:t>cwKeyingActive</w:t>
+      </w:r>
+    </w:p>
+    <w:p>
+      <w:r>
+        <w:t xml:space="preserve">from </w:t>
+      </w:r>
+      <w:r>
+        <w:rPr>
+          <w:b/>
+        </w:rPr>
+        <w:t>forward power</w:t>
+      </w:r>
+      <w:r>
+        <w:t xml:space="preserve"> (&gt;=0.5 W, ~500 ms hang), gated to CW mode, skipped while CWX drives it — this HL2+ reads non-zero </w:t>
+      </w:r>
+      <w:r>
+        <w:rPr>
+          <w:rFonts w:ascii="Consolas" w:hAnsi="Consolas"/>
+          <w:sz w:val="18"/>
+        </w:rPr>
+        <w:t>ptt_in</w:t>
+      </w:r>
+      <w:r>
+        <w:t xml:space="preserve"> at rest (§10 Q#1), so forward power is the clean signal.</w:t>
+      </w:r>
+    </w:p>
+    <w:p>
+      <w:pPr>
+        <w:pStyle w:val="ListBullet"/>
+        <w:ind w:left="360"/>
+      </w:pPr>
+      <w:r>
+        <w:t xml:space="preserve">The panadapter spectrum </w:t>
+      </w:r>
+      <w:r>
+        <w:rPr>
+          <w:b/>
+        </w:rPr>
+        <w:t>stays RX</w:t>
+      </w:r>
+      <w:r>
+        <w:t xml:space="preserve"> during CW (gateware CW never feeds the</w:t>
+      </w:r>
+    </w:p>
+    <w:p>
+      <w:r>
+        <w:t>WDSP TX analyzer -&gt; swapping shows an empty pan; RX shows the keyed carrier). Operator-confirmed regression + fix.</w:t>
+      </w:r>
+    </w:p>
+    <w:p>
+      <w:pPr>
+        <w:pStyle w:val="Heading3"/>
+      </w:pPr>
+      <w:r>
+        <w:t>Release / docs / wiki</w:t>
+      </w:r>
+    </w:p>
+    <w:p>
+      <w:pPr>
+        <w:pStyle w:val="ListBullet"/>
+        <w:ind w:left="360"/>
+      </w:pPr>
+      <w:r>
+        <w:t xml:space="preserve">Version 0.4.7-&gt;0.4.8 (CMake </w:t>
+      </w:r>
+      <w:r>
+        <w:rPr>
+          <w:rFonts w:ascii="Consolas" w:hAnsi="Consolas"/>
+          <w:sz w:val="18"/>
+        </w:rPr>
+        <w:t>project(VERSION)</w:t>
+      </w:r>
+      <w:r>
+        <w:t xml:space="preserve"> + </w:t>
+      </w:r>
+      <w:r>
+        <w:rPr>
+          <w:rFonts w:ascii="Consolas" w:hAnsi="Consolas"/>
+          <w:sz w:val="18"/>
+        </w:rPr>
+        <w:t>installer/lyra.iss</w:t>
+      </w:r>
+      <w:r>
+        <w:t>).</w:t>
+      </w:r>
+    </w:p>
+    <w:p>
+      <w:r>
+        <w:rPr>
+          <w:rFonts w:ascii="Consolas" w:hAnsi="Consolas"/>
+          <w:sz w:val="18"/>
+        </w:rPr>
+        <w:t>docs/releases/v0.4.8.md</w:t>
+      </w:r>
+      <w:r>
+        <w:t xml:space="preserve">; USER_GUIDE "Getting around the window" rewritten + Meter CW note; README Features-&gt;v0.4.8. ISCC -&gt; </w:t>
+      </w:r>
+      <w:r>
+        <w:rPr>
+          <w:rFonts w:ascii="Consolas" w:hAnsi="Consolas"/>
+          <w:sz w:val="18"/>
+        </w:rPr>
+        <w:t>dist/Lyra-Setup-0.4.8.exe</w:t>
+      </w:r>
+      <w:r>
+        <w:t xml:space="preserve"> (69 MB). Tag </w:t>
+      </w:r>
+      <w:r>
+        <w:rPr>
+          <w:rFonts w:ascii="Consolas" w:hAnsi="Consolas"/>
+          <w:sz w:val="18"/>
+        </w:rPr>
+        <w:t>v0.4.8</w:t>
+      </w:r>
+      <w:r>
+        <w:t>, pushed main+tag, GitHub Release published w/ installer.</w:t>
+      </w:r>
+    </w:p>
+    <w:p>
+      <w:pPr>
+        <w:pStyle w:val="ListBullet"/>
+        <w:ind w:left="360"/>
+      </w:pPr>
+      <w:r>
+        <w:rPr>
+          <w:b/>
+        </w:rPr>
+        <w:t>GitHub Wiki initialized + built</w:t>
+      </w:r>
+      <w:r>
+        <w:t>: Home, User Guide (mirror of</w:t>
+      </w:r>
+    </w:p>
+    <w:p>
+      <w:r>
+        <w:t xml:space="preserve">USER_GUIDE.md), Installing-and-first-connection, FAQ-and-Troubleshooting, _Sidebar. Sources version-controlled in </w:t>
+      </w:r>
+      <w:r>
+        <w:rPr>
+          <w:rFonts w:ascii="Consolas" w:hAnsi="Consolas"/>
+          <w:sz w:val="18"/>
+        </w:rPr>
+        <w:t>docs/wiki/</w:t>
+      </w:r>
+      <w:r>
+        <w:t xml:space="preserve"> (User Guide generated from USER_GUIDE.md at publish). NB: the first wiki page must be created once in the web UI (no API, no push-init) — operator did it; rest pushed via </w:t>
+      </w:r>
+      <w:r>
+        <w:rPr>
+          <w:rFonts w:ascii="Consolas" w:hAnsi="Consolas"/>
+          <w:sz w:val="18"/>
+        </w:rPr>
+        <w:t>…wiki.git</w:t>
+      </w:r>
+      <w:r>
+        <w:t>.</w:t>
+      </w:r>
+    </w:p>
+    <w:p>
+      <w:pPr>
+        <w:pStyle w:val="Heading3"/>
+      </w:pPr>
+      <w:r>
+        <w:t>CW decoder accuracy review (analysis only — NOTHING changed)</w:t>
+      </w:r>
+    </w:p>
+    <w:p>
+      <w:pPr>
+        <w:pStyle w:val="ListBullet"/>
+        <w:ind w:left="360"/>
+      </w:pPr>
+      <w:r>
+        <w:t>Recovered the 4-reviewer + code-cross-checked review (was transcript-only)</w:t>
+      </w:r>
+    </w:p>
+    <w:p>
+      <w:r>
+        <w:t xml:space="preserve">and committed it: </w:t>
+      </w:r>
+      <w:r>
+        <w:rPr>
+          <w:b/>
+        </w:rPr>
+        <w:t>`docs/CW_DECODER_REVIEW.md`</w:t>
+      </w:r>
+      <w:r>
+        <w:t xml:space="preserve"> (Tiers A–D). Target = </w:t>
+      </w:r>
+      <w:r>
+        <w:rPr>
+          <w:rFonts w:ascii="Consolas" w:hAnsi="Consolas"/>
+          <w:sz w:val="18"/>
+        </w:rPr>
+        <w:t>src/dsp/CwDecoder.cpp/.h</w:t>
+      </w:r>
+      <w:r>
+        <w:t xml:space="preserve"> (field-tuned constants).</w:t>
+      </w:r>
+    </w:p>
+    <w:p>
+      <w:pPr>
+        <w:pStyle w:val="ListBullet"/>
+        <w:ind w:left="360"/>
+      </w:pPr>
+      <w:r>
+        <w:t xml:space="preserve">Operator chose the safe </w:t>
+      </w:r>
+      <w:r>
+        <w:rPr>
+          <w:b/>
+        </w:rPr>
+        <w:t>A-slice = A1+A2+A3+A5</w:t>
+      </w:r>
+      <w:r>
+        <w:t xml:space="preserve"> to do next (nearest-code</w:t>
+      </w:r>
+    </w:p>
+    <w:p>
+      <w:r>
+        <w:rPr>
+          <w:rFonts w:ascii="Consolas" w:hAnsi="Consolas"/>
+          <w:sz w:val="18"/>
+        </w:rPr>
+        <w:t>?</w:t>
+      </w:r>
+      <w:r>
+        <w:t xml:space="preserve"> rescue / AFC center-bias / per-char confidence / crash-proof peak-snap — none touch the tuned constants; rule: never corrupt a correct decode). Then </w:t>
+      </w:r>
+      <w:r>
+        <w:rPr>
+          <w:b/>
+        </w:rPr>
+        <w:t>B1</w:t>
+      </w:r>
+      <w:r>
+        <w:t xml:space="preserve"> (independent dah-length + the √3-vs-1.565 boundary discontinuity). NOT STARTED. See [[project-lyra-cpp-cw-decoder-accuracy]].</w:t>
+      </w:r>
     </w:p>
     <w:p>
       <w:pPr>
@@ -11922,7 +12595,7 @@
         <w:color w:val="808080"/>
         <w:sz w:val="16"/>
       </w:rPr>
-      <w:t>lyra-cpp — Session Log — auto-generated 2026-06-23 09:18 (source: SESSION_LOG.md)</w:t>
+      <w:t>lyra-cpp — Session Log — auto-generated 2026-06-24 18:49 (source: SESSION_LOG.md)</w:t>
     </w:r>
   </w:p>
 </w:hdr>

</xml_diff>

<commit_message>
docs(session-log): v0.4.10 entry — CTUN drag-the-marker fix + CW decoder A-series + decoder User Guide; regen pdf/docx
Co-Authored-By: Claude Opus 4.8 (1M context) <noreply@anthropic.com>
</commit_message>
<xml_diff>
--- a/docs/SESSION_LOG.docx
+++ b/docs/SESSION_LOG.docx
@@ -13,6 +13,472 @@
     <w:p>
       <w:r>
         <w:t>Running EOD log. Newest entry on top. Short rough-outline format.</w:t>
+      </w:r>
+    </w:p>
+    <w:p>
+      <w:pPr>
+        <w:pBdr>
+          <w:bottom w:val="single" w:sz="6" w:color="808080"/>
+        </w:pBdr>
+      </w:pPr>
+    </w:p>
+    <w:p>
+      <w:pPr>
+        <w:pStyle w:val="Heading2"/>
+      </w:pPr>
+      <w:r>
+        <w:t>2026-06-25 — v0.4.10 RELEASED: CTUN drag-the-marker (4th look, FIXED) + CW decoder A-series + CW-decoder docs</w:t>
+      </w:r>
+    </w:p>
+    <w:p>
+      <w:r>
+        <w:t xml:space="preserve">Working on </w:t>
+      </w:r>
+      <w:r>
+        <w:rPr>
+          <w:rFonts w:ascii="Consolas" w:hAnsi="Consolas"/>
+          <w:sz w:val="18"/>
+        </w:rPr>
+        <w:t>main</w:t>
+      </w:r>
+      <w:r>
+        <w:t xml:space="preserve">. Two releases since v0.4.8: </w:t>
+      </w:r>
+      <w:r>
+        <w:rPr>
+          <w:b/>
+        </w:rPr>
+        <w:t>v0.4.9</w:t>
+      </w:r>
+      <w:r>
+        <w:t xml:space="preserve"> (fast patch — floating tool panels are float-only, Lock no longer disables the CW console/decoder; </w:t>
+      </w:r>
+      <w:r>
+        <w:rPr>
+          <w:rFonts w:ascii="Consolas" w:hAnsi="Consolas"/>
+          <w:sz w:val="18"/>
+        </w:rPr>
+        <w:t>162906f</w:t>
+      </w:r>
+      <w:r>
+        <w:t xml:space="preserve">) and today's </w:t>
+      </w:r>
+      <w:r>
+        <w:rPr>
+          <w:b/>
+        </w:rPr>
+        <w:t>v0.4.10</w:t>
+      </w:r>
+      <w:r>
+        <w:t xml:space="preserve"> (</w:t>
+      </w:r>
+      <w:r>
+        <w:rPr>
+          <w:rFonts w:ascii="Consolas" w:hAnsi="Consolas"/>
+          <w:sz w:val="18"/>
+        </w:rPr>
+        <w:t>ebb3c67</w:t>
+      </w:r>
+      <w:r>
+        <w:t>).</w:t>
+      </w:r>
+    </w:p>
+    <w:p>
+      <w:pPr>
+        <w:pStyle w:val="Heading3"/>
+      </w:pPr>
+      <w:r>
+        <w:t>CTUN #174 — 4th look, the pass that actually fixed it (`PanadapterPanel.qml`)</w:t>
+      </w:r>
+    </w:p>
+    <w:p>
+      <w:pPr>
+        <w:pStyle w:val="ListBullet"/>
+        <w:ind w:left="360"/>
+      </w:pPr>
+      <w:r>
+        <w:t>Operator (Thetis Help open as ground truth) said CTUN still wasn't Thetis</w:t>
+      </w:r>
+    </w:p>
+    <w:p>
+      <w:r>
+        <w:t>after the v0.4.4/v0.4.5 "parity" rebuilds: you should drag the FREQ MARKER onto signals with the display LOCKED; a click INSIDE the filter must NOT jump the 0-beat.</w:t>
+      </w:r>
+    </w:p>
+    <w:p>
+      <w:pPr>
+        <w:pStyle w:val="ListBullet"/>
+        <w:ind w:left="360"/>
+      </w:pPr>
+      <w:r>
+        <w:t>Read the real Thetis mouse handlers FIRST (console.cs 50230-50433 press +</w:t>
+      </w:r>
+    </w:p>
+    <w:p>
+      <w:r>
+        <w:t>51887-51960 drag). The DSP core (locked-LO + WDSP NCO shift) was already right; the whole gap was the MOUSE + MARKER layer.</w:t>
+      </w:r>
+    </w:p>
+    <w:p>
+      <w:pPr>
+        <w:pStyle w:val="ListBullet"/>
+        <w:ind w:left="360"/>
+      </w:pPr>
+      <w:r>
+        <w:t>ROOT CAUSE the 3 prior passes all missed: Lyra's carrier marker is</w:t>
+      </w:r>
+    </w:p>
+    <w:p>
+      <w:r>
+        <w:t>hard-pinned to the locked display centre (</w:t>
+      </w:r>
+      <w:r>
+        <w:rPr>
+          <w:rFonts w:ascii="Consolas" w:hAnsi="Consolas"/>
+          <w:sz w:val="18"/>
+        </w:rPr>
+        <w:t>markerOffsetHz</w:t>
+      </w:r>
+      <w:r>
+        <w:t xml:space="preserve"> = CW pitch only), so under CTUN there was NO marker tracking the dial — nothing to drag. First bench report: "marker does not move."</w:t>
+      </w:r>
+    </w:p>
+    <w:p>
+      <w:pPr>
+        <w:pStyle w:val="ListBullet"/>
+        <w:ind w:left="360"/>
+      </w:pPr>
+      <w:r>
+        <w:t xml:space="preserve">Fix (CTUN-gated, non-CTUN byte-identical): new </w:t>
+      </w:r>
+      <w:r>
+        <w:rPr>
+          <w:rFonts w:ascii="Consolas" w:hAnsi="Consolas"/>
+          <w:sz w:val="18"/>
+        </w:rPr>
+        <w:t>ctunDialOffHz</w:t>
+      </w:r>
+      <w:r>
+        <w:t xml:space="preserve"> slides the</w:t>
+      </w:r>
+    </w:p>
+    <w:p>
+      <w:r>
+        <w:t>carrier marker + filter passband to (rx1FreqHz − centre); body-drag = relative 1:1 marker-grab (</w:t>
+      </w:r>
+      <w:r>
+        <w:rPr>
+          <w:rFonts w:ascii="Consolas" w:hAnsi="Consolas"/>
+          <w:sz w:val="18"/>
+        </w:rPr>
+        <w:t>setRx1FreqHz</w:t>
+      </w:r>
+      <w:r>
+        <w:t>); top-15px strip = LO pan (</w:t>
+      </w:r>
+      <w:r>
+        <w:rPr>
+          <w:rFonts w:ascii="Consolas" w:hAnsi="Consolas"/>
+          <w:sz w:val="18"/>
+        </w:rPr>
+        <w:t>setCtuneCenterHz</w:t>
+      </w:r>
+      <w:r>
+        <w:t>); inside-passband click suppresses the retune; the edge-drag + inPassband math subtract the dial offset.</w:t>
+      </w:r>
+    </w:p>
+    <w:p>
+      <w:pPr>
+        <w:pStyle w:val="ListBullet"/>
+        <w:ind w:left="360"/>
+      </w:pPr>
+      <w:r>
+        <w:t>Operator-bench-CONFIRMED "Do as Thetis does state." #174 DONE.</w:t>
+      </w:r>
+    </w:p>
+    <w:p>
+      <w:pPr>
+        <w:pStyle w:val="Heading3"/>
+      </w:pPr>
+      <w:r>
+        <w:t>CW decoder — rest of the safe Tier-A A-series (A4/A6/A7/A8) (`CwDecoder.cpp/.h`)</w:t>
+      </w:r>
+    </w:p>
+    <w:p>
+      <w:pPr>
+        <w:pStyle w:val="ListBullet"/>
+        <w:ind w:left="360"/>
+      </w:pPr>
+      <w:r>
+        <w:t>A-slice A1/A2/A3/A5 was committed last session (</w:t>
+      </w:r>
+      <w:r>
+        <w:rPr>
+          <w:rFonts w:ascii="Consolas" w:hAnsi="Consolas"/>
+          <w:sz w:val="18"/>
+        </w:rPr>
+        <w:t>eb4c89d</w:t>
+      </w:r>
+      <w:r>
+        <w:t>). v0.4.10 adds:</w:t>
+      </w:r>
+    </w:p>
+    <w:p>
+      <w:pPr>
+        <w:pStyle w:val="ListBullet"/>
+        <w:ind w:left="792"/>
+      </w:pPr>
+      <w:r>
+        <w:t>A4 sub-bin AFC: 3-pt parabolic interp on the winning Goertzel bin</w:t>
+      </w:r>
+    </w:p>
+    <w:p>
+      <w:r>
+        <w:t>(refines bestHz only).</w:t>
+      </w:r>
+    </w:p>
+    <w:p>
+      <w:pPr>
+        <w:pStyle w:val="ListBullet"/>
+        <w:ind w:left="792"/>
+      </w:pPr>
+      <w:r>
+        <w:t>A6 hysteretic SNR gate: open at squelch×floor, hold to 0.8× that</w:t>
+      </w:r>
+    </w:p>
+    <w:p>
+      <w:r>
+        <w:t>(≈1.2× floor); inert on clean signal.</w:t>
+      </w:r>
+    </w:p>
+    <w:p>
+      <w:pPr>
+        <w:pStyle w:val="ListBullet"/>
+        <w:ind w:left="792"/>
+      </w:pPr>
+      <w:r>
+        <w:t>A7 unify the two word-gap emitters: guard the processEdge Word emit with</w:t>
+      </w:r>
+    </w:p>
+    <w:p>
+      <w:r>
+        <w:rPr>
+          <w:rFonts w:ascii="Consolas" w:hAnsi="Consolas"/>
+          <w:sz w:val="18"/>
+        </w:rPr>
+        <w:t>lastEmitted_ != ' '</w:t>
+      </w:r>
+      <w:r>
+        <w:t xml:space="preserve"> so a word gap can't double-emit.</w:t>
+      </w:r>
+    </w:p>
+    <w:p>
+      <w:pPr>
+        <w:pStyle w:val="ListBullet"/>
+        <w:ind w:left="792"/>
+      </w:pPr>
+      <w:r>
+        <w:t xml:space="preserve">A8 add </w:t>
+      </w:r>
+      <w:r>
+        <w:rPr>
+          <w:rFonts w:ascii="Consolas" w:hAnsi="Consolas"/>
+          <w:sz w:val="18"/>
+        </w:rPr>
+        <w:t>_</w:t>
+      </w:r>
+      <w:r>
+        <w:t xml:space="preserve"> / </w:t>
+      </w:r>
+      <w:r>
+        <w:rPr>
+          <w:rFonts w:ascii="Consolas" w:hAnsi="Consolas"/>
+          <w:sz w:val="18"/>
+        </w:rPr>
+        <w:t>$</w:t>
+      </w:r>
+      <w:r>
+        <w:t xml:space="preserve"> punctuation; prosigns deliberately omitted (alias +/( ).</w:t>
+      </w:r>
+    </w:p>
+    <w:p>
+      <w:pPr>
+        <w:pStyle w:val="ListBullet"/>
+        <w:ind w:left="360"/>
+      </w:pPr>
+      <w:r>
+        <w:t>All additive — correct decodes unchanged, ~35 tuned constants untouched.</w:t>
+      </w:r>
+    </w:p>
+    <w:p>
+      <w:r>
+        <w:t>Unit test ALL PASS (VVV TEST CQ / CQ PARIS / CQ TEST; AFC lock 749).</w:t>
+      </w:r>
+    </w:p>
+    <w:p>
+      <w:pPr>
+        <w:pStyle w:val="Heading3"/>
+      </w:pPr>
+      <w:r>
+        <w:t>CW decoder docs (`USER_GUIDE.md`)</w:t>
+      </w:r>
+    </w:p>
+    <w:p>
+      <w:pPr>
+        <w:pStyle w:val="ListBullet"/>
+        <w:ind w:left="360"/>
+      </w:pPr>
+      <w:r>
+        <w:t>Operator couldn't recall what the decoder NB / DSP-filter did → realised</w:t>
+      </w:r>
+    </w:p>
+    <w:p>
+      <w:r>
+        <w:t>none of the decoder was documented (+ a stale "decoder coming in a later release" line). Added "Reading CW — the RX decoder" section + TOC entry: panel, confidence dimming, decoded-call/name grab → His Call / Name (feeds {CALL}/{NAME}), Match-TX-to-RX-WPM, and every detector knob. Console His-call cross-linked to the decoder grab.</w:t>
+      </w:r>
+    </w:p>
+    <w:p>
+      <w:pPr>
+        <w:pStyle w:val="Heading3"/>
+      </w:pPr>
+      <w:r>
+        <w:t>B1 anchor (NEXT CW work — NOT started)</w:t>
+      </w:r>
+    </w:p>
+    <w:p>
+      <w:pPr>
+        <w:pStyle w:val="ListBullet"/>
+        <w:ind w:left="360"/>
+      </w:pPr>
+      <w:r>
+        <w:t xml:space="preserve">Benched a live </w:t>
+      </w:r>
+      <w:r>
+        <w:rPr>
+          <w:b/>
+        </w:rPr>
+        <w:t>W1AW</w:t>
+      </w:r>
+      <w:r>
+        <w:t xml:space="preserve"> run; it announces its own speed ("END OF 30WPM</w:t>
+      </w:r>
+    </w:p>
+    <w:p>
+      <w:r>
+        <w:t xml:space="preserve">TEXT", "NOW 25 WPM") = labeled truth. Sent 30→25 wpm, decoder read </w:t>
+      </w:r>
+      <w:r>
+        <w:rPr>
+          <w:b/>
+        </w:rPr>
+        <w:t>35</w:t>
+      </w:r>
+      <w:r>
+        <w:t xml:space="preserve"> → over-reads ~15-20%, dit estimate runs short. Copy still readable; residual errors (WILL→WIRL, ONCE→JNCE) are valid-letter swaps A1 can't touch by design. W1AW = the labeled bench to tune B1 (independent dah-length + warm-up/Gaussian boundary fix).</w:t>
+      </w:r>
+    </w:p>
+    <w:p>
+      <w:pPr>
+        <w:pStyle w:val="Heading3"/>
+      </w:pPr>
+      <w:r>
+        <w:t>Release mechanics + standing</w:t>
+      </w:r>
+    </w:p>
+    <w:p>
+      <w:pPr>
+        <w:pStyle w:val="ListBullet"/>
+        <w:ind w:left="360"/>
+      </w:pPr>
+      <w:r>
+        <w:t>0.4.9 → 0.4.10 (CMakeLists / lyra.iss / README); notes</w:t>
+      </w:r>
+    </w:p>
+    <w:p>
+      <w:r>
+        <w:rPr>
+          <w:rFonts w:ascii="Consolas" w:hAnsi="Consolas"/>
+          <w:sz w:val="18"/>
+        </w:rPr>
+        <w:t>docs/releases/v0.4.10.md</w:t>
+      </w:r>
+      <w:r>
+        <w:t xml:space="preserve">. Commit </w:t>
+      </w:r>
+      <w:r>
+        <w:rPr>
+          <w:rFonts w:ascii="Consolas" w:hAnsi="Consolas"/>
+          <w:sz w:val="18"/>
+        </w:rPr>
+        <w:t>ebb3c67</w:t>
+      </w:r>
+      <w:r>
+        <w:t xml:space="preserve">, tag </w:t>
+      </w:r>
+      <w:r>
+        <w:rPr>
+          <w:rFonts w:ascii="Consolas" w:hAnsi="Consolas"/>
+          <w:sz w:val="18"/>
+        </w:rPr>
+        <w:t>v0.4.10</w:t>
+      </w:r>
+      <w:r>
+        <w:t xml:space="preserve">, pushed main + tag, GitHub release + </w:t>
+      </w:r>
+      <w:r>
+        <w:rPr>
+          <w:rFonts w:ascii="Consolas" w:hAnsi="Consolas"/>
+          <w:sz w:val="18"/>
+        </w:rPr>
+        <w:t>dist/Lyra-Setup-0.4.10.exe</w:t>
+      </w:r>
+      <w:r>
+        <w:t xml:space="preserve"> published.</w:t>
+      </w:r>
+    </w:p>
+    <w:p>
+      <w:pPr>
+        <w:pStyle w:val="ListBullet"/>
+        <w:ind w:left="360"/>
+      </w:pPr>
+      <w:r>
+        <w:t xml:space="preserve">Daily backup task ("Lyra-cpp Daily Backup", 22:30 → </w:t>
+      </w:r>
+      <w:r>
+        <w:rPr>
+          <w:rFonts w:ascii="Consolas" w:hAnsi="Consolas"/>
+          <w:sz w:val="18"/>
+        </w:rPr>
+        <w:t>_backups/</w:t>
+      </w:r>
+      <w:r>
+        <w:t xml:space="preserve"> + mirror</w:t>
+      </w:r>
+    </w:p>
+    <w:p>
+      <w:r>
+        <w:rPr>
+          <w:rFonts w:ascii="Consolas" w:hAnsi="Consolas"/>
+          <w:sz w:val="18"/>
+        </w:rPr>
+        <w:t>Z:\LyraBU\</w:t>
+      </w:r>
+      <w:r>
+        <w:t>) confirmed ACTIVE + healthy (last run 6/24 OK, 0x0).</w:t>
+      </w:r>
+    </w:p>
+    <w:p>
+      <w:pPr>
+        <w:pStyle w:val="ListBullet"/>
+        <w:ind w:left="360"/>
+      </w:pPr>
+      <w:r>
+        <w:t>Open: CW B1 (with the W1AW bench). CTUN done. Bigger arcs still open —</w:t>
+      </w:r>
+    </w:p>
+    <w:p>
+      <w:r>
+        <w:t>RX2 #96-101, CW macro chips #176, grab-spot-as-call #182, PureSignal.</w:t>
       </w:r>
     </w:p>
     <w:p>
@@ -12595,7 +13061,7 @@
         <w:color w:val="808080"/>
         <w:sz w:val="16"/>
       </w:rPr>
-      <w:t>lyra-cpp — Session Log — auto-generated 2026-06-24 18:49 (source: SESSION_LOG.md)</w:t>
+      <w:t>lyra-cpp — Session Log — auto-generated 2026-06-25 19:34 (source: SESSION_LOG.md)</w:t>
     </w:r>
   </w:p>
 </w:hdr>

</xml_diff>

<commit_message>
docs: FM arc — USER_GUIDE pre-emphasis/clean-chain/Dev-auto-BW + SESSION_LOG (FM + v0.6.0 + v0.5.0); regen PDF/DOCX
USER_GUIDE: FM section rewritten (Deviation / Pre-emphasis Comm-Off / CTCSS
+ the why-of-pre-emphasis + FM auto-bypasses the speech rack + Tuning-panel
Emph chip + Deviation auto-sizes RX BW); TX-BW and Lock bullets note the FM
auto-width (deviation-derived occupied readout, RX presets = FM channel
widths); Tuning-panel FM front-row bullets add Emph + Dev-auto-BW.

SESSION_LOG: new 2026-06-29 FM-arc entry (#2 band-limit, mode-aware BW, #3a
Off/Comm selector, #3b-3 rack auto-bypass, Tuning chip + Dev->RX-BW, 50/75us
dropped + 300 Hz HPF deferred with the emph.c reasoning) + the 2026-06-28
v0.6.0 release entry (PA Gain tab + auto-cal watts cap + FM fix #1); also
commits the previously-orphaned 2026-06-27 v0.5.0 entry. PDF + DOCX regen
via tools/sync_execution_plan.py.

Co-Authored-By: Claude Opus 4.8 (1M context) <noreply@anthropic.com>
</commit_message>
<xml_diff>
--- a/docs/SESSION_LOG.docx
+++ b/docs/SESSION_LOG.docx
@@ -13,6 +13,1464 @@
     <w:p>
       <w:r>
         <w:t>Running EOD log. Newest entry on top. Short rough-outline format.</w:t>
+      </w:r>
+    </w:p>
+    <w:p>
+      <w:pPr>
+        <w:pBdr>
+          <w:bottom w:val="single" w:sz="6" w:color="808080"/>
+        </w:pBdr>
+      </w:pPr>
+    </w:p>
+    <w:p>
+      <w:pPr>
+        <w:pStyle w:val="Heading2"/>
+      </w:pPr>
+      <w:r>
+        <w:t>2026-06-29 — FM TX "beat Thetis" arc (pre-emphasis + clean chain + Tuning-panel UX)</w:t>
+      </w:r>
+    </w:p>
+    <w:p>
+      <w:r>
+        <w:t xml:space="preserve">All on </w:t>
+      </w:r>
+      <w:r>
+        <w:rPr>
+          <w:rFonts w:ascii="Consolas" w:hAnsi="Consolas"/>
+          <w:sz w:val="18"/>
+        </w:rPr>
+        <w:t>main</w:t>
+      </w:r>
+      <w:r>
+        <w:t xml:space="preserve">, unreleased (on top of v0.6.0). The FM transmit arc, brought to a complete stopping point. WDSP study-first: read </w:t>
+      </w:r>
+      <w:r>
+        <w:rPr>
+          <w:rFonts w:ascii="Consolas" w:hAnsi="Consolas"/>
+          <w:sz w:val="18"/>
+        </w:rPr>
+        <w:t>fmmod.c</w:t>
+      </w:r>
+      <w:r>
+        <w:t xml:space="preserve"> + </w:t>
+      </w:r>
+      <w:r>
+        <w:rPr>
+          <w:rFonts w:ascii="Consolas" w:hAnsi="Consolas"/>
+          <w:sz w:val="18"/>
+        </w:rPr>
+        <w:t>emph.c</w:t>
+      </w:r>
+      <w:r>
+        <w:t xml:space="preserve"> in full before touching shipped behaviour.</w:t>
+      </w:r>
+    </w:p>
+    <w:p>
+      <w:pPr>
+        <w:pStyle w:val="Heading3"/>
+      </w:pPr>
+      <w:r>
+        <w:t>FM Fix #2 — clean audio band-limit (`b72bc50`, earlier; logged for completeness)</w:t>
+      </w:r>
+    </w:p>
+    <w:p>
+      <w:pPr>
+        <w:pStyle w:val="ListBullet"/>
+        <w:ind w:left="360"/>
+      </w:pPr>
+      <w:r>
+        <w:t xml:space="preserve">The FM primary bandpass </w:t>
+      </w:r>
+      <w:r>
+        <w:rPr>
+          <w:rFonts w:ascii="Consolas" w:hAnsi="Consolas"/>
+          <w:sz w:val="18"/>
+        </w:rPr>
+        <w:t>bp0</w:t>
+      </w:r>
+      <w:r>
+        <w:t xml:space="preserve"> runs on the AUDIO before </w:t>
+      </w:r>
+      <w:r>
+        <w:rPr>
+          <w:rFonts w:ascii="Consolas" w:hAnsi="Consolas"/>
+          <w:sz w:val="18"/>
+        </w:rPr>
+        <w:t>xfmmod</w:t>
+      </w:r>
+      <w:r>
+        <w:t>, so it's</w:t>
+      </w:r>
+    </w:p>
+    <w:p>
+      <w:r>
+        <w:t xml:space="preserve">now a symmetric </w:t>
+      </w:r>
+      <w:r>
+        <w:rPr>
+          <w:b/>
+        </w:rPr>
+        <w:t>±3 kHz brick-wall AF low-pass</w:t>
+      </w:r>
+      <w:r>
+        <w:t xml:space="preserve"> (was inheriting ±(dev+3k) ≈ ±8 k, over-feeding the modulator). The occupied-RF (Carson) clamp stays owned by the modulator's own internal bandpass, pinned via new </w:t>
+      </w:r>
+      <w:r>
+        <w:rPr>
+          <w:rFonts w:ascii="Consolas" w:hAnsi="Consolas"/>
+          <w:sz w:val="18"/>
+        </w:rPr>
+        <w:t>SetTXAFMAFFreqs(txch, 300, 3000)</w:t>
+      </w:r>
+      <w:r>
+        <w:t xml:space="preserve"> on FM entry. Supersedes Fix #1's bp0 value (v0.6.0).</w:t>
+      </w:r>
+    </w:p>
+    <w:p>
+      <w:pPr>
+        <w:pStyle w:val="Heading3"/>
+      </w:pPr>
+      <w:r>
+        <w:t>Mode-aware FM bandwidth (`4f32ca1`, earlier) — `ModeFilterPanel.qml`</w:t>
+      </w:r>
+    </w:p>
+    <w:p>
+      <w:pPr>
+        <w:pStyle w:val="ListBullet"/>
+        <w:ind w:left="360"/>
+      </w:pPr>
+      <w:r>
+        <w:t>FM TX-BW selector + RX↔TX 🔗 lock disabled in FM (FM width is derived from</w:t>
+      </w:r>
+    </w:p>
+    <w:p>
+      <w:r>
+        <w:t xml:space="preserve">deviation). TX-BW box is a read-only </w:t>
+      </w:r>
+      <w:r>
+        <w:rPr>
+          <w:b/>
+        </w:rPr>
+        <w:t>"&lt;N&gt; k (auto)"</w:t>
+      </w:r>
+      <w:r>
+        <w:t xml:space="preserve"> Carson readout </w:t>
+      </w:r>
+      <w:r>
+        <w:rPr>
+          <w:rFonts w:ascii="Consolas" w:hAnsi="Consolas"/>
+          <w:sz w:val="18"/>
+        </w:rPr>
+        <w:t>2·(dev+3k)</w:t>
+      </w:r>
+      <w:r>
+        <w:t>, live-tracking Dev. FM RX presets = FM channel widths</w:t>
+      </w:r>
+    </w:p>
+    <w:p>
+      <w:r>
+        <w:rPr>
+          <w:b/>
+        </w:rPr>
+        <w:t>8/10/12/16 k</w:t>
+      </w:r>
+      <w:r>
+        <w:t xml:space="preserve"> (was the SSB list).</w:t>
+      </w:r>
+    </w:p>
+    <w:p>
+      <w:pPr>
+        <w:pStyle w:val="Heading3"/>
+      </w:pPr>
+      <w:r>
+        <w:t>#3a — pre-emphasis selector Off / Comm (`a826c8c`)</w:t>
+      </w:r>
+    </w:p>
+    <w:p>
+      <w:pPr>
+        <w:pStyle w:val="ListBullet"/>
+        <w:ind w:left="360"/>
+      </w:pPr>
+      <w:r>
+        <w:t xml:space="preserve">WDSP-native via </w:t>
+      </w:r>
+      <w:r>
+        <w:rPr>
+          <w:rFonts w:ascii="Consolas" w:hAnsi="Consolas"/>
+          <w:sz w:val="18"/>
+        </w:rPr>
+        <w:t>SetTXAFMEmphPosition</w:t>
+      </w:r>
+      <w:r>
+        <w:t xml:space="preserve"> (bound in wdspcalls X-macro):</w:t>
+      </w:r>
+    </w:p>
+    <w:p>
+      <w:r>
+        <w:rPr>
+          <w:b/>
+        </w:rPr>
+        <w:t>Comm</w:t>
+      </w:r>
+      <w:r>
+        <w:t xml:space="preserve"> = position 1 = the native 6 dB/oct (300–3000) comms curve runs;</w:t>
+      </w:r>
+    </w:p>
+    <w:p>
+      <w:r>
+        <w:rPr>
+          <w:b/>
+        </w:rPr>
+        <w:t>Off</w:t>
+      </w:r>
+      <w:r>
+        <w:t xml:space="preserve"> = position 2 = both call sites pass through = a TRUE bypass (FM force-runs the emph block, so the chain position is the on/off — a real Off, which rigs/Thetis don't give you).</w:t>
+      </w:r>
+    </w:p>
+    <w:p>
+      <w:pPr>
+        <w:pStyle w:val="ListBullet"/>
+        <w:ind w:left="360"/>
+      </w:pPr>
+      <w:r>
+        <w:rPr>
+          <w:rFonts w:ascii="Consolas" w:hAnsi="Consolas"/>
+          <w:sz w:val="18"/>
+        </w:rPr>
+        <w:t>HL2Stream</w:t>
+      </w:r>
+      <w:r>
+        <w:t xml:space="preserve"> </w:t>
+      </w:r>
+      <w:r>
+        <w:rPr>
+          <w:rFonts w:ascii="Consolas" w:hAnsi="Consolas"/>
+          <w:sz w:val="18"/>
+        </w:rPr>
+        <w:t>fmEmphasisMode</w:t>
+      </w:r>
+      <w:r>
+        <w:t xml:space="preserve"> Q_PROPERTY (0=Off, 1=Comm, default Comm) +</w:t>
+      </w:r>
+    </w:p>
+    <w:p>
+      <w:r>
+        <w:t xml:space="preserve">QSettings </w:t>
+      </w:r>
+      <w:r>
+        <w:rPr>
+          <w:rFonts w:ascii="Consolas" w:hAnsi="Consolas"/>
+          <w:sz w:val="18"/>
+        </w:rPr>
+        <w:t>tx/fmEmphasisMode</w:t>
+      </w:r>
+      <w:r>
+        <w:t xml:space="preserve"> + </w:t>
+      </w:r>
+      <w:r>
+        <w:rPr>
+          <w:rFonts w:ascii="Consolas" w:hAnsi="Consolas"/>
+          <w:sz w:val="18"/>
+        </w:rPr>
+        <w:t>TxControl::setFmEmphasis</w:t>
+      </w:r>
+      <w:r>
+        <w:t xml:space="preserve"> callback; applied on FM entry in </w:t>
+      </w:r>
+      <w:r>
+        <w:rPr>
+          <w:rFonts w:ascii="Consolas" w:hAnsi="Consolas"/>
+          <w:sz w:val="18"/>
+        </w:rPr>
+        <w:t>pushTxFilter</w:t>
+      </w:r>
+      <w:r>
+        <w:t xml:space="preserve"> + live on operator change.</w:t>
+      </w:r>
+    </w:p>
+    <w:p>
+      <w:pPr>
+        <w:pStyle w:val="ListBullet"/>
+        <w:ind w:left="360"/>
+      </w:pPr>
+      <w:r>
+        <w:t xml:space="preserve">UI: </w:t>
+      </w:r>
+      <w:r>
+        <w:rPr>
+          <w:b/>
+        </w:rPr>
+        <w:t>Settings → TX → FM</w:t>
+      </w:r>
+      <w:r>
+        <w:t xml:space="preserve"> combo (beside Deviation / CTCSS).</w:t>
+      </w:r>
+    </w:p>
+    <w:p>
+      <w:pPr>
+        <w:pStyle w:val="Heading3"/>
+      </w:pPr>
+      <w:r>
+        <w:t>#3b-3 — FM auto-bypasses the native mic rack (`12c8991`)</w:t>
+      </w:r>
+    </w:p>
+    <w:p>
+      <w:pPr>
+        <w:pStyle w:val="ListBullet"/>
+        <w:ind w:left="360"/>
+      </w:pPr>
+      <w:r>
+        <w:t>In FM the whole TX rack (EQ + Combinator + Plate + speech enhancements)</w:t>
+      </w:r>
+    </w:p>
+    <w:p>
+      <w:r>
+        <w:t xml:space="preserve">auto-bypasses, same forced-auto as the digital modes — a multiband compressor/reverb into FM's pre-emphasis = mush. One-line predicate change in </w:t>
+      </w:r>
+      <w:r>
+        <w:rPr>
+          <w:rFonts w:ascii="Consolas" w:hAnsi="Consolas"/>
+          <w:sz w:val="18"/>
+        </w:rPr>
+        <w:t>main.cpp</w:t>
+      </w:r>
+      <w:r>
+        <w:t xml:space="preserve"> (</w:t>
+      </w:r>
+      <w:r>
+        <w:rPr>
+          <w:rFonts w:ascii="Consolas" w:hAnsi="Consolas"/>
+          <w:sz w:val="18"/>
+        </w:rPr>
+        <w:t>txModeBypassesRack</w:t>
+      </w:r>
+      <w:r>
+        <w:t xml:space="preserve"> now fires for "FM" alongside DIGU/DIGL → </w:t>
+      </w:r>
+      <w:r>
+        <w:rPr>
+          <w:rFonts w:ascii="Consolas" w:hAnsi="Consolas"/>
+          <w:sz w:val="18"/>
+        </w:rPr>
+        <w:t>SetTxRackBypass</w:t>
+      </w:r>
+      <w:r>
+        <w:t>).</w:t>
+      </w:r>
+    </w:p>
+    <w:p>
+      <w:pPr>
+        <w:pStyle w:val="Heading3"/>
+      </w:pPr>
+      <w:r>
+        <w:t>Tuning-panel UX (`67abf05`) — `TuningPanel.qml`</w:t>
+      </w:r>
+    </w:p>
+    <w:p>
+      <w:pPr>
+        <w:pStyle w:val="ListBullet"/>
+        <w:ind w:left="360"/>
+      </w:pPr>
+      <w:r>
+        <w:rPr>
+          <w:b/>
+        </w:rPr>
+        <w:t>Emph</w:t>
+      </w:r>
+      <w:r>
+        <w:t xml:space="preserve"> quick chip (Comm / Off) added to the FM front row beside Dev/RPT,</w:t>
+      </w:r>
+    </w:p>
+    <w:p>
+      <w:r>
+        <w:t xml:space="preserve">two-way-synced with Settings via the shared </w:t>
+      </w:r>
+      <w:r>
+        <w:rPr>
+          <w:rFonts w:ascii="Consolas" w:hAnsi="Consolas"/>
+          <w:sz w:val="18"/>
+        </w:rPr>
+        <w:t>Stream.fmEmphasisMode</w:t>
+      </w:r>
+      <w:r>
+        <w:t xml:space="preserve"> prop.</w:t>
+      </w:r>
+    </w:p>
+    <w:p>
+      <w:pPr>
+        <w:pStyle w:val="ListBullet"/>
+        <w:ind w:left="360"/>
+      </w:pPr>
+      <w:r>
+        <w:rPr>
+          <w:b/>
+        </w:rPr>
+        <w:t>Deviation now auto-sizes RX bandwidth</w:t>
+      </w:r>
+      <w:r>
+        <w:t xml:space="preserve"> to the smallest FM channel</w:t>
+      </w:r>
+    </w:p>
+    <w:p>
+      <w:r>
+        <w:t xml:space="preserve">preset ≥ Carson </w:t>
+      </w:r>
+      <w:r>
+        <w:rPr>
+          <w:rFonts w:ascii="Consolas" w:hAnsi="Consolas"/>
+          <w:sz w:val="18"/>
+        </w:rPr>
+        <w:t>2·(dev+3k)</w:t>
+      </w:r>
+      <w:r>
+        <w:t xml:space="preserve"> — ±2.5 k → 12 k, ±5 k → 16 k. TX BW was already deviation-derived; RX now follows (Thetis-style). Still overridable in the Filters panel.</w:t>
+      </w:r>
+    </w:p>
+    <w:p>
+      <w:pPr>
+        <w:pStyle w:val="Heading3"/>
+      </w:pPr>
+      <w:r>
+        <w:t>#3b 50/75 µs + 300 Hz HPF — DROPPED / DEFERRED (operator call)</w:t>
+      </w:r>
+    </w:p>
+    <w:p>
+      <w:pPr>
+        <w:pStyle w:val="ListBullet"/>
+        <w:ind w:left="360"/>
+      </w:pPr>
+      <w:r>
+        <w:t xml:space="preserve">Read </w:t>
+      </w:r>
+      <w:r>
+        <w:rPr>
+          <w:rFonts w:ascii="Consolas" w:hAnsi="Consolas"/>
+          <w:sz w:val="18"/>
+        </w:rPr>
+        <w:t>emph.c</w:t>
+      </w:r>
+      <w:r>
+        <w:t>: WDSP FM pre-emph is a 6 dB/oct ramp between f_low/f_high.</w:t>
+      </w:r>
+    </w:p>
+    <w:p>
+      <w:r>
+        <w:rPr>
+          <w:b/>
+        </w:rPr>
+        <w:t>50/75 µs are broadcast-FM constants</w:t>
+      </w:r>
+      <w:r>
+        <w:t xml:space="preserve"> (15 kHz audio, ±75 kHz dev), meaningless over our 3 kHz comms band (75 µs corner ≈2122 Hz = a weak top-end lift; 50 µs corner ≈3183 Hz is *above* the 3 kHz cutoff → no pre-emph at all). "Comm" already IS the correct amateur curve → 50/75 µs</w:t>
+      </w:r>
+    </w:p>
+    <w:p>
+      <w:r>
+        <w:rPr>
+          <w:b/>
+        </w:rPr>
+        <w:t>dropped</w:t>
+      </w:r>
+      <w:r>
+        <w:t xml:space="preserve"> (dead UI options). </w:t>
+      </w:r>
+      <w:r>
+        <w:rPr>
+          <w:b/>
+        </w:rPr>
+        <w:t>300 Hz low-cut deferred</w:t>
+      </w:r>
+      <w:r>
+        <w:t xml:space="preserve"> — needs a new native HPF stage (can't ride bp0 = Hilbert trap; rack is bypassed in FM), mostly redundant with Comm's bass rolloff; build only if FM-data-flat bass-cut is later wanted.</w:t>
+      </w:r>
+    </w:p>
+    <w:p>
+      <w:pPr>
+        <w:pStyle w:val="Heading3"/>
+      </w:pPr>
+      <w:r>
+        <w:t>Docs</w:t>
+      </w:r>
+    </w:p>
+    <w:p>
+      <w:pPr>
+        <w:pStyle w:val="ListBullet"/>
+        <w:ind w:left="360"/>
+      </w:pPr>
+      <w:r>
+        <w:t>USER_GUIDE: FM section rewritten (deviation / pre-emphasis / CTCSS +</w:t>
+      </w:r>
+    </w:p>
+    <w:p>
+      <w:r>
+        <w:t>clean-chain note + Tuning-panel mirror + Dev→RX-BW); TX-BW + Lock bullets note the FM auto-width behaviour; Tuning-panel FM front-row bullets updated.</w:t>
+      </w:r>
+    </w:p>
+    <w:p>
+      <w:pPr>
+        <w:pBdr>
+          <w:bottom w:val="single" w:sz="6" w:color="808080"/>
+        </w:pBdr>
+      </w:pPr>
+    </w:p>
+    <w:p>
+      <w:pPr>
+        <w:pStyle w:val="Heading2"/>
+      </w:pPr>
+      <w:r>
+        <w:t>2026-06-28 — v0.6.0 RELEASED: per-band TX power model + auto-calibrated watts cap + FM fix #1</w:t>
+      </w:r>
+    </w:p>
+    <w:p>
+      <w:r>
+        <w:t xml:space="preserve">Released </w:t>
+      </w:r>
+      <w:r>
+        <w:rPr>
+          <w:rFonts w:ascii="Consolas" w:hAnsi="Consolas"/>
+          <w:sz w:val="18"/>
+        </w:rPr>
+        <w:t>v0.6.0</w:t>
+      </w:r>
+      <w:r>
+        <w:t xml:space="preserve"> (</w:t>
+      </w:r>
+      <w:r>
+        <w:rPr>
+          <w:rFonts w:ascii="Consolas" w:hAnsi="Consolas"/>
+          <w:sz w:val="18"/>
+        </w:rPr>
+        <w:t>5b41fc3</w:t>
+      </w:r>
+      <w:r>
+        <w:t xml:space="preserve">; installer </w:t>
+      </w:r>
+      <w:r>
+        <w:rPr>
+          <w:rFonts w:ascii="Consolas" w:hAnsi="Consolas"/>
+          <w:sz w:val="18"/>
+        </w:rPr>
+        <w:t>dist/Lyra-Setup-0.6.0.exe</w:t>
+      </w:r>
+      <w:r>
+        <w:t>, 68.2 MB, GitHub release published; main FF'd). Bundled the whole TX power-model arc + the first FM fix that had been pending on main.</w:t>
+      </w:r>
+    </w:p>
+    <w:p>
+      <w:pPr>
+        <w:pStyle w:val="Heading3"/>
+      </w:pPr>
+      <w:r>
+        <w:t>Per-band TX power model (Settings → **PA Gain** tab)</w:t>
+      </w:r>
+    </w:p>
+    <w:p>
+      <w:pPr>
+        <w:pStyle w:val="ListBullet"/>
+        <w:ind w:left="360"/>
+      </w:pPr>
+      <w:r>
+        <w:t xml:space="preserve">ChannelMaster </w:t>
+      </w:r>
+      <w:r>
+        <w:rPr>
+          <w:rFonts w:ascii="Consolas" w:hAnsi="Consolas"/>
+          <w:sz w:val="18"/>
+        </w:rPr>
+        <w:t>txgain.c</w:t>
+      </w:r>
+      <w:r>
+        <w:t xml:space="preserve"> ported → </w:t>
+      </w:r>
+      <w:r>
+        <w:rPr>
+          <w:rFonts w:ascii="Consolas" w:hAnsi="Consolas"/>
+          <w:sz w:val="18"/>
+        </w:rPr>
+        <w:t>wire/TxGain.*</w:t>
+      </w:r>
+      <w:r>
+        <w:t>; operator drive% drives a</w:t>
+      </w:r>
+    </w:p>
+    <w:p>
+      <w:r>
+        <w:t xml:space="preserve">digital fixed gain (Thetis RadioVolume) on top of the AD9866 byte, so </w:t>
+      </w:r>
+      <w:r>
+        <w:rPr>
+          <w:b/>
+        </w:rPr>
+        <w:t>1 % drive is a true sub-watt</w:t>
+      </w:r>
+      <w:r>
+        <w:t xml:space="preserve"> (was pinned at the ~0.78 W nibble-0 dead zone).</w:t>
+      </w:r>
+    </w:p>
+    <w:p>
+      <w:pPr>
+        <w:pStyle w:val="ListBullet"/>
+        <w:ind w:left="360"/>
+      </w:pPr>
+      <w:r>
+        <w:t xml:space="preserve">Per-band </w:t>
+      </w:r>
+      <w:r>
+        <w:rPr>
+          <w:b/>
+        </w:rPr>
+        <w:t>PA Gain table</w:t>
+      </w:r>
+      <w:r>
+        <w:t xml:space="preserve"> (</w:t>
+      </w:r>
+      <w:r>
+        <w:rPr>
+          <w:rFonts w:ascii="Consolas" w:hAnsi="Consolas"/>
+          <w:sz w:val="18"/>
+        </w:rPr>
+        <w:t>RadioVolume = min(drive·gbb[band]/100/93.75,1)</w:t>
+      </w:r>
+      <w:r>
+        <w:t>)</w:t>
+      </w:r>
+    </w:p>
+    <w:p>
+      <w:r>
+        <w:t>so the dial can be tuned to read true watts per band.</w:t>
+      </w:r>
+    </w:p>
+    <w:p>
+      <w:pPr>
+        <w:pStyle w:val="ListBullet"/>
+        <w:ind w:left="360"/>
+      </w:pPr>
+      <w:r>
+        <w:rPr>
+          <w:b/>
+        </w:rPr>
+        <w:t>Watts Max cap</w:t>
+      </w:r>
+      <w:r>
+        <w:t xml:space="preserve"> (amp protection) + </w:t>
+      </w:r>
+      <w:r>
+        <w:rPr>
+          <w:b/>
+        </w:rPr>
+        <w:t>auto-calibrate</w:t>
+      </w:r>
+      <w:r>
+        <w:t>: key TUN per band</w:t>
+      </w:r>
+    </w:p>
+    <w:p>
+      <w:r>
+        <w:t>into a dummy and Lyra walks power up to the cap and locks that band exactly (✓), SS-amp-safe (approach-from-below). Coloured Cap-tuned marks (green ✓ tuned / red — not tuned). The old "Max TX drive %" (#170) control retired.</w:t>
+      </w:r>
+    </w:p>
+    <w:p>
+      <w:pPr>
+        <w:pStyle w:val="Heading3"/>
+      </w:pPr>
+      <w:r>
+        <w:t>FM fix #1 (`ae6eb19`) — FM Carson bandpass clamp (value later superseded by Fix #2)</w:t>
+      </w:r>
+    </w:p>
+    <w:p>
+      <w:pPr>
+        <w:pStyle w:val="ListBullet"/>
+        <w:ind w:left="360"/>
+      </w:pPr>
+      <w:r>
+        <w:t>FM output bandpass sized from the FM signal's own occupied channel instead</w:t>
+      </w:r>
+    </w:p>
+    <w:p>
+      <w:r>
+        <w:t>of inheriting the wide SSB/ESSB TX width → no FM splatter at wide TX BW.</w:t>
+      </w:r>
+    </w:p>
+    <w:p>
+      <w:pPr>
+        <w:pStyle w:val="Heading3"/>
+      </w:pPr>
+      <w:r>
+        <w:t>Docs</w:t>
+      </w:r>
+    </w:p>
+    <w:p>
+      <w:pPr>
+        <w:pStyle w:val="ListBullet"/>
+        <w:ind w:left="360"/>
+      </w:pPr>
+      <w:r>
+        <w:t xml:space="preserve">USER_GUIDE "Settings → PA Gain" section; </w:t>
+      </w:r>
+      <w:r>
+        <w:rPr>
+          <w:rFonts w:ascii="Consolas" w:hAnsi="Consolas"/>
+          <w:sz w:val="18"/>
+        </w:rPr>
+        <w:t>docs/releases/v0.6.0.md</w:t>
+      </w:r>
+      <w:r>
+        <w:t>; README</w:t>
+      </w:r>
+    </w:p>
+    <w:p>
+      <w:r>
+        <w:t>bumped to v0.6.0.</w:t>
+      </w:r>
+    </w:p>
+    <w:p>
+      <w:pPr>
+        <w:pBdr>
+          <w:bottom w:val="single" w:sz="6" w:color="808080"/>
+        </w:pBdr>
+      </w:pPr>
+    </w:p>
+    <w:p>
+      <w:pPr>
+        <w:pStyle w:val="Heading2"/>
+      </w:pPr>
+      <w:r>
+        <w:t>2026-06-27 — v0.5.0 RELEASED: DX-cluster spots subsystem (#182) + CW RX-decoder overhaul (#187) + #159 DSP filter type</w:t>
+      </w:r>
+    </w:p>
+    <w:p>
+      <w:r>
+        <w:t xml:space="preserve">Released </w:t>
+      </w:r>
+      <w:r>
+        <w:rPr>
+          <w:rFonts w:ascii="Consolas" w:hAnsi="Consolas"/>
+          <w:sz w:val="18"/>
+        </w:rPr>
+        <w:t>v0.5.0</w:t>
+      </w:r>
+      <w:r>
+        <w:t xml:space="preserve"> (</w:t>
+      </w:r>
+      <w:r>
+        <w:rPr>
+          <w:rFonts w:ascii="Consolas" w:hAnsi="Consolas"/>
+          <w:sz w:val="18"/>
+        </w:rPr>
+        <w:t>63b0799</w:t>
+      </w:r>
+      <w:r>
+        <w:t xml:space="preserve">; CW </w:t>
+      </w:r>
+      <w:r>
+        <w:rPr>
+          <w:rFonts w:ascii="Consolas" w:hAnsi="Consolas"/>
+          <w:sz w:val="18"/>
+        </w:rPr>
+        <w:t>7ebc599</w:t>
+      </w:r>
+      <w:r>
+        <w:t xml:space="preserve">) — two commits on </w:t>
+      </w:r>
+      <w:r>
+        <w:rPr>
+          <w:rFonts w:ascii="Consolas" w:hAnsi="Consolas"/>
+          <w:sz w:val="18"/>
+        </w:rPr>
+        <w:t>main</w:t>
+      </w:r>
+      <w:r>
+        <w:t xml:space="preserve">, installer </w:t>
+      </w:r>
+      <w:r>
+        <w:rPr>
+          <w:rFonts w:ascii="Consolas" w:hAnsi="Consolas"/>
+          <w:sz w:val="18"/>
+        </w:rPr>
+        <w:t>dist/Lyra-Setup-0.5.0.exe</w:t>
+      </w:r>
+      <w:r>
+        <w:t xml:space="preserve"> (68.2 MB) published as a GitHub release. (v0.4.11 — the Kenwood CAT-over-COM/TCP + serial-PTT arc — shipped between v0.4.10 and this; it has its own release notes.)</w:t>
+      </w:r>
+    </w:p>
+    <w:p>
+      <w:pPr>
+        <w:pStyle w:val="Heading3"/>
+      </w:pPr>
+      <w:r>
+        <w:t>DX-cluster spots subsystem #182 — the headline (`spotstore.*`, `spothole_feeder.*`, `dxcluster_feeder.*`, `dxcc.*`, `PanadapterPanel.qml`, `settingsdialog.*`)</w:t>
+      </w:r>
+    </w:p>
+    <w:p>
+      <w:pPr>
+        <w:pStyle w:val="ListBullet"/>
+        <w:ind w:left="360"/>
+      </w:pPr>
+      <w:r>
+        <w:t xml:space="preserve">Source-agnostic </w:t>
+      </w:r>
+      <w:r>
+        <w:rPr>
+          <w:b/>
+        </w:rPr>
+        <w:t>spot bus</w:t>
+      </w:r>
+      <w:r>
+        <w:t xml:space="preserve"> (</w:t>
+      </w:r>
+      <w:r>
+        <w:rPr>
+          <w:rFonts w:ascii="Consolas" w:hAnsi="Consolas"/>
+          <w:sz w:val="18"/>
+        </w:rPr>
+        <w:t>SpotStore</w:t>
+      </w:r>
+      <w:r>
+        <w:t>): call-keyed dedup, age-out,</w:t>
+      </w:r>
+    </w:p>
+    <w:p>
+      <w:r>
+        <w:t xml:space="preserve">own-call highlight + toast, </w:t>
+      </w:r>
+      <w:r>
+        <w:rPr>
+          <w:rFonts w:ascii="Consolas" w:hAnsi="Consolas"/>
+          <w:sz w:val="18"/>
+        </w:rPr>
+        <w:t>source</w:t>
+      </w:r>
+      <w:r>
+        <w:t>/</w:t>
+      </w:r>
+      <w:r>
+        <w:rPr>
+          <w:rFonts w:ascii="Consolas" w:hAnsi="Consolas"/>
+          <w:sz w:val="18"/>
+        </w:rPr>
+        <w:t>continent</w:t>
+      </w:r>
+      <w:r>
+        <w:t>/</w:t>
+      </w:r>
+      <w:r>
+        <w:rPr>
+          <w:rFonts w:ascii="Consolas" w:hAnsi="Consolas"/>
+          <w:sz w:val="18"/>
+        </w:rPr>
+        <w:t>firstSeen</w:t>
+      </w:r>
+      <w:r>
+        <w:t xml:space="preserve"> fields.</w:t>
+      </w:r>
+    </w:p>
+    <w:p>
+      <w:pPr>
+        <w:pStyle w:val="ListBullet"/>
+        <w:ind w:left="360"/>
+      </w:pPr>
+      <w:r>
+        <w:rPr>
+          <w:b/>
+        </w:rPr>
+        <w:t>3 feeders</w:t>
+      </w:r>
+      <w:r>
+        <w:t>, each its own on/off (Settings → Network → DX-cluster spots):</w:t>
+      </w:r>
+    </w:p>
+    <w:p>
+      <w:pPr>
+        <w:pStyle w:val="ListBullet"/>
+        <w:ind w:left="792"/>
+      </w:pPr>
+      <w:r>
+        <w:rPr>
+          <w:b/>
+        </w:rPr>
+        <w:t>TCI</w:t>
+      </w:r>
+      <w:r>
+        <w:t xml:space="preserve"> inbound (logger / SDRLogger+) — </w:t>
+      </w:r>
+      <w:r>
+        <w:rPr>
+          <w:rFonts w:ascii="Consolas" w:hAnsi="Consolas"/>
+          <w:sz w:val="18"/>
+        </w:rPr>
+        <w:t>addSpot(...,source="tci")</w:t>
+      </w:r>
+      <w:r>
+        <w:t>.</w:t>
+      </w:r>
+    </w:p>
+    <w:p>
+      <w:pPr>
+        <w:pStyle w:val="ListBullet"/>
+        <w:ind w:left="792"/>
+      </w:pPr>
+      <w:r>
+        <w:rPr>
+          <w:b/>
+        </w:rPr>
+        <w:t>SpotHole REST</w:t>
+      </w:r>
+      <w:r>
+        <w:t xml:space="preserve"> (</w:t>
+      </w:r>
+      <w:r>
+        <w:rPr>
+          <w:rFonts w:ascii="Consolas" w:hAnsi="Consolas"/>
+          <w:sz w:val="18"/>
+        </w:rPr>
+        <w:t>SpotHoleFeeder</w:t>
+      </w:r>
+      <w:r>
+        <w:t xml:space="preserve">) — </w:t>
+      </w:r>
+      <w:r>
+        <w:rPr>
+          <w:rFonts w:ascii="Consolas" w:hAnsi="Consolas"/>
+          <w:sz w:val="18"/>
+        </w:rPr>
+        <w:t>spothole.app/api/v1/spots</w:t>
+      </w:r>
+      <w:r>
+        <w:t>,</w:t>
+      </w:r>
+    </w:p>
+    <w:p>
+      <w:r>
+        <w:t xml:space="preserve">standalone (internet only), default-OFF poll. Parse is </w:t>
+      </w:r>
+      <w:r>
+        <w:rPr>
+          <w:b/>
+        </w:rPr>
+        <w:t>snake_case</w:t>
+      </w:r>
+      <w:r>
+        <w:t xml:space="preserve"> (</w:t>
+      </w:r>
+      <w:r>
+        <w:rPr>
+          <w:rFonts w:ascii="Consolas" w:hAnsi="Consolas"/>
+          <w:sz w:val="18"/>
+        </w:rPr>
+        <w:t>dx_call</w:t>
+      </w:r>
+      <w:r>
+        <w:t xml:space="preserve"> / </w:t>
+      </w:r>
+      <w:r>
+        <w:rPr>
+          <w:rFonts w:ascii="Consolas" w:hAnsi="Consolas"/>
+          <w:sz w:val="18"/>
+        </w:rPr>
+        <w:t>freq</w:t>
+      </w:r>
+      <w:r>
+        <w:t xml:space="preserve"> in </w:t>
+      </w:r>
+      <w:r>
+        <w:rPr>
+          <w:b/>
+        </w:rPr>
+        <w:t>Hz</w:t>
+      </w:r>
+      <w:r>
+        <w:t xml:space="preserve"> / </w:t>
+      </w:r>
+      <w:r>
+        <w:rPr>
+          <w:rFonts w:ascii="Consolas" w:hAnsi="Consolas"/>
+          <w:sz w:val="18"/>
+        </w:rPr>
+        <w:t>de_call</w:t>
+      </w:r>
+      <w:r>
+        <w:t xml:space="preserve"> / </w:t>
+      </w:r>
+      <w:r>
+        <w:rPr>
+          <w:rFonts w:ascii="Consolas" w:hAnsi="Consolas"/>
+          <w:sz w:val="18"/>
+        </w:rPr>
+        <w:t>dx_continent</w:t>
+      </w:r>
+      <w:r>
+        <w:t xml:space="preserve"> / skip </w:t>
+      </w:r>
+      <w:r>
+        <w:rPr>
+          <w:rFonts w:ascii="Consolas" w:hAnsi="Consolas"/>
+          <w:sz w:val="18"/>
+        </w:rPr>
+        <w:t>qrt</w:t>
+      </w:r>
+      <w:r>
+        <w:t>) — first cut used hamlog's processed field names and got zero spots; fixed by probing the raw API.</w:t>
+      </w:r>
+    </w:p>
+    <w:p>
+      <w:pPr>
+        <w:pStyle w:val="ListBullet"/>
+        <w:ind w:left="792"/>
+      </w:pPr>
+      <w:r>
+        <w:rPr>
+          <w:b/>
+        </w:rPr>
+        <w:t>DX-cluster telnet</w:t>
+      </w:r>
+      <w:r>
+        <w:t xml:space="preserve"> (</w:t>
+      </w:r>
+      <w:r>
+        <w:rPr>
+          <w:rFonts w:ascii="Consolas" w:hAnsi="Consolas"/>
+          <w:sz w:val="18"/>
+        </w:rPr>
+        <w:t>DxClusterFeeder</w:t>
+      </w:r>
+      <w:r>
+        <w:t>) — host/port/login-call</w:t>
+      </w:r>
+    </w:p>
+    <w:p>
+      <w:r>
+        <w:t xml:space="preserve">(defaults MYCALL, overridable) + login-commands, auto-login + auto-reconnect 20 s. NOTE: VE7CC-type nodes default to </w:t>
+      </w:r>
+      <w:r>
+        <w:rPr>
+          <w:b/>
+        </w:rPr>
+        <w:t>RBN CW skimmer only</w:t>
+      </w:r>
+      <w:r>
+        <w:t xml:space="preserve">; </w:t>
+      </w:r>
+      <w:r>
+        <w:rPr>
+          <w:rFonts w:ascii="Consolas" w:hAnsi="Consolas"/>
+          <w:sz w:val="18"/>
+        </w:rPr>
+        <w:t>set/ft8;set/ft4</w:t>
+      </w:r>
+      <w:r>
+        <w:t xml:space="preserve"> login cmds open up FT8/FT4 (confirmed by reading the node banner — not a bug).</w:t>
+      </w:r>
+    </w:p>
+    <w:p>
+      <w:pPr>
+        <w:pStyle w:val="ListBullet"/>
+        <w:ind w:left="360"/>
+      </w:pPr>
+      <w:r>
+        <w:rPr>
+          <w:b/>
+        </w:rPr>
+        <w:t>Filters</w:t>
+      </w:r>
+      <w:r>
+        <w:t xml:space="preserve"> (display-only; the bus keeps everything): </w:t>
+      </w:r>
+      <w:r>
+        <w:rPr>
+          <w:rFonts w:ascii="Consolas" w:hAnsi="Consolas"/>
+          <w:sz w:val="18"/>
+        </w:rPr>
+        <w:t>modeShown</w:t>
+      </w:r>
+    </w:p>
+    <w:p>
+      <w:r>
+        <w:t xml:space="preserve">(family-aware CW/SSB/DIGI/AM/FM), </w:t>
+      </w:r>
+      <w:r>
+        <w:rPr>
+          <w:rFonts w:ascii="Consolas" w:hAnsi="Consolas"/>
+          <w:sz w:val="18"/>
+        </w:rPr>
+        <w:t>regionShown</w:t>
+      </w:r>
+      <w:r>
+        <w:t xml:space="preserve"> + </w:t>
+      </w:r>
+      <w:r>
+        <w:rPr>
+          <w:rFonts w:ascii="Consolas" w:hAnsi="Consolas"/>
+          <w:sz w:val="18"/>
+        </w:rPr>
+        <w:t>DxccLookup::continentOf</w:t>
+      </w:r>
+      <w:r>
+        <w:t xml:space="preserve"> ISO-2→continent table (continent codes NA/EU/AS/SA/AF/OC always mean continents, else ISO-2 country; "US,EU" = US + all Europe).</w:t>
+      </w:r>
+    </w:p>
+    <w:p>
+      <w:pPr>
+        <w:pStyle w:val="ListBullet"/>
+        <w:ind w:left="360"/>
+      </w:pPr>
+      <w:r>
+        <w:rPr>
+          <w:b/>
+        </w:rPr>
+        <w:t>Clutter caps</w:t>
+      </w:r>
+      <w:r>
+        <w:t>: per-freq bucket cap (</w:t>
+      </w:r>
+      <w:r>
+        <w:rPr>
+          <w:rFonts w:ascii="Consolas" w:hAnsi="Consolas"/>
+          <w:sz w:val="18"/>
+        </w:rPr>
+        <w:t>freqHz/bucketHz</w:t>
+      </w:r>
+      <w:r>
+        <w:t xml:space="preserve"> bins, keep N</w:t>
+      </w:r>
+    </w:p>
+    <w:p>
+      <w:r>
+        <w:t>newest, "+K more" badge — tames FT8 piles) + global display cap.</w:t>
+      </w:r>
+    </w:p>
+    <w:p>
+      <w:pPr>
+        <w:pStyle w:val="ListBullet"/>
+        <w:ind w:left="360"/>
+      </w:pPr>
+      <w:r>
+        <w:rPr>
+          <w:b/>
+        </w:rPr>
+        <w:t>Colour modes</w:t>
+      </w:r>
+      <w:r>
+        <w:t>: source / single / by-mode / by-region / by-country +</w:t>
+      </w:r>
+    </w:p>
+    <w:p>
+      <w:r>
+        <w:t>optional legend (</w:t>
+      </w:r>
+      <w:r>
+        <w:rPr>
+          <w:rFonts w:ascii="Consolas" w:hAnsi="Consolas"/>
+          <w:sz w:val="18"/>
+        </w:rPr>
+        <w:t>legendEntries()</w:t>
+      </w:r>
+      <w:r>
+        <w:t xml:space="preserve"> Q_INVOKABLE). </w:t>
+      </w:r>
+      <w:r>
+        <w:rPr>
+          <w:b/>
+        </w:rPr>
+        <w:t>New-spot colour</w:t>
+      </w:r>
+      <w:r>
+        <w:t xml:space="preserve">: a fresh spot wears a solid colour for N s (driven by </w:t>
+      </w:r>
+      <w:r>
+        <w:rPr>
+          <w:rFonts w:ascii="Consolas" w:hAnsi="Consolas"/>
+          <w:sz w:val="18"/>
+        </w:rPr>
+        <w:t>firstSeen</w:t>
+      </w:r>
+      <w:r>
+        <w:t xml:space="preserve">, not </w:t>
+      </w:r>
+      <w:r>
+        <w:rPr>
+          <w:rFonts w:ascii="Consolas" w:hAnsi="Consolas"/>
+          <w:sz w:val="18"/>
+        </w:rPr>
+        <w:t>added</w:t>
+      </w:r>
+      <w:r>
+        <w:t xml:space="preserve">, so a re-poll doesn't reset it) then settles. Two bugs fixed here: spots flipping green↔gold every poll (separated </w:t>
+      </w:r>
+      <w:r>
+        <w:rPr>
+          <w:rFonts w:ascii="Consolas" w:hAnsi="Consolas"/>
+          <w:sz w:val="18"/>
+        </w:rPr>
+        <w:t>firstSeen</w:t>
+      </w:r>
+      <w:r>
+        <w:t xml:space="preserve"> from </w:t>
+      </w:r>
+      <w:r>
+        <w:rPr>
+          <w:rFonts w:ascii="Consolas" w:hAnsi="Consolas"/>
+          <w:sz w:val="18"/>
+        </w:rPr>
+        <w:t>added</w:t>
+      </w:r>
+      <w:r>
+        <w:t>), and the original blink flashing EVERYTHING on startup (reverted blink → solid new-spot colour; renamed all "Flash" UI + docs → "new spot colour" so folks don't expect a blink).</w:t>
+      </w:r>
+    </w:p>
+    <w:p>
+      <w:pPr>
+        <w:pStyle w:val="ListBullet"/>
+        <w:ind w:left="360"/>
+      </w:pPr>
+      <w:r>
+        <w:rPr>
+          <w:b/>
+        </w:rPr>
+        <w:t>Console import</w:t>
+      </w:r>
+      <w:r>
+        <w:t xml:space="preserve">: click a spot → tune to it + </w:t>
+      </w:r>
+      <w:r>
+        <w:rPr>
+          <w:rFonts w:ascii="Consolas" w:hAnsi="Consolas"/>
+          <w:sz w:val="18"/>
+        </w:rPr>
+        <w:t>CwMacros.hisCall</w:t>
+      </w:r>
+      <w:r>
+        <w:t xml:space="preserve"> grabs</w:t>
+      </w:r>
+    </w:p>
+    <w:p>
+      <w:r>
+        <w:t>the call into the CW-console contact row (#176/#181).</w:t>
+      </w:r>
+    </w:p>
+    <w:p>
+      <w:pPr>
+        <w:pStyle w:val="ListBullet"/>
+        <w:ind w:left="360"/>
+      </w:pPr>
+      <w:r>
+        <w:t>Band display filter DEFERRED (redundant on the panadapter; lands with a</w:t>
+      </w:r>
+    </w:p>
+    <w:p>
+      <w:r>
+        <w:t>future spot-LIST view).</w:t>
+      </w:r>
+    </w:p>
+    <w:p>
+      <w:pPr>
+        <w:pStyle w:val="Heading3"/>
+      </w:pPr>
+      <w:r>
+        <w:t>CW RX-decoder overhaul #187 (`CwDecoderPanel.qml`)</w:t>
+      </w:r>
+    </w:p>
+    <w:p>
+      <w:pPr>
+        <w:pStyle w:val="ListBullet"/>
+        <w:ind w:left="360"/>
+      </w:pPr>
+      <w:r>
+        <w:t xml:space="preserve">Decode-window </w:t>
+      </w:r>
+      <w:r>
+        <w:rPr>
+          <w:b/>
+        </w:rPr>
+        <w:t>scroll fix</w:t>
+      </w:r>
+      <w:r>
+        <w:t>: ScrollView + `onContentHeightChanged →</w:t>
+      </w:r>
+    </w:p>
+    <w:p>
+      <w:r>
+        <w:t>Qt.callLater(scrollToBottom)` so rows stop clipping at the 3rd line before a resize. (Took two passes — the first "fixed" it only until the text reflowed.)</w:t>
+      </w:r>
+    </w:p>
+    <w:p>
+      <w:pPr>
+        <w:pStyle w:val="ListBullet"/>
+        <w:ind w:left="360"/>
+      </w:pPr>
+      <w:r>
+        <w:t xml:space="preserve">Narrow detect-filter BW chips tuned to </w:t>
+      </w:r>
+      <w:r>
+        <w:rPr>
+          <w:rFonts w:ascii="Consolas" w:hAnsi="Consolas"/>
+          <w:sz w:val="18"/>
+        </w:rPr>
+        <w:t>[80,100,120,150]</w:t>
+      </w:r>
+      <w:r>
+        <w:t>; Auto level</w:t>
+      </w:r>
+    </w:p>
+    <w:p>
+      <w:r>
+        <w:t>with live readout; Advanced (Seek / DSP filter / AFC range). Operator copy-confirmed on real Field Day CW (S4–S9, 10–25 wpm).</w:t>
+      </w:r>
+    </w:p>
+    <w:p>
+      <w:pPr>
+        <w:pStyle w:val="Heading3"/>
+      </w:pPr>
+      <w:r>
+        <w:t>Also shipped</w:t>
+      </w:r>
+    </w:p>
+    <w:p>
+      <w:pPr>
+        <w:pStyle w:val="ListBullet"/>
+        <w:ind w:left="360"/>
+      </w:pPr>
+      <w:r>
+        <w:rPr>
+          <w:b/>
+        </w:rPr>
+        <w:t>CW console scroll</w:t>
+      </w:r>
+      <w:r>
+        <w:t xml:space="preserve"> (</w:t>
+      </w:r>
+      <w:r>
+        <w:rPr>
+          <w:rFonts w:ascii="Consolas" w:hAnsi="Consolas"/>
+          <w:sz w:val="18"/>
+        </w:rPr>
+        <w:t>CwConsolePanel.qml</w:t>
+      </w:r>
+      <w:r>
+        <w:t xml:space="preserve">): wrapped </w:t>
+      </w:r>
+      <w:r>
+        <w:rPr>
+          <w:rFonts w:ascii="Consolas" w:hAnsi="Consolas"/>
+          <w:sz w:val="18"/>
+        </w:rPr>
+        <w:t>body</w:t>
+      </w:r>
+      <w:r>
+        <w:t xml:space="preserve"> in a</w:t>
+      </w:r>
+    </w:p>
+    <w:p>
+      <w:r>
+        <w:t>ScrollView so the macro tags + bottom option rows stay reachable when the console is sized small.</w:t>
+      </w:r>
+    </w:p>
+    <w:p>
+      <w:pPr>
+        <w:pStyle w:val="ListBullet"/>
+        <w:ind w:left="360"/>
+      </w:pPr>
+      <w:r>
+        <w:rPr>
+          <w:b/>
+        </w:rPr>
+        <w:t>#159 DSP filter type</w:t>
+      </w:r>
+      <w:r>
+        <w:t xml:space="preserve"> (Linear Phase / Low Latency per mode family,</w:t>
+      </w:r>
+    </w:p>
+    <w:p>
+      <w:r>
+        <w:t>opt-in) — was the prior pending item; rode out with v0.5.0.</w:t>
+      </w:r>
+    </w:p>
+    <w:p>
+      <w:pPr>
+        <w:pStyle w:val="Heading3"/>
+      </w:pPr>
+      <w:r>
+        <w:t>Docs / release</w:t>
+      </w:r>
+    </w:p>
+    <w:p>
+      <w:pPr>
+        <w:pStyle w:val="ListBullet"/>
+        <w:ind w:left="360"/>
+      </w:pPr>
+      <w:r>
+        <w:t>USER_GUIDE: new "DX-cluster spots" section + reworked "Reading CW — the</w:t>
+      </w:r>
+    </w:p>
+    <w:p>
+      <w:r>
+        <w:t>RX decoder" section; #159 Linear Phase / Low Latency already present.</w:t>
+      </w:r>
+    </w:p>
+    <w:p>
+      <w:pPr>
+        <w:pStyle w:val="ListBullet"/>
+        <w:ind w:left="360"/>
+      </w:pPr>
+      <w:r>
+        <w:rPr>
+          <w:rFonts w:ascii="Consolas" w:hAnsi="Consolas"/>
+          <w:sz w:val="18"/>
+        </w:rPr>
+        <w:t>docs/releases/v0.5.0.md</w:t>
+      </w:r>
+      <w:r>
+        <w:t>; version single-sourced via CMake</w:t>
+      </w:r>
+    </w:p>
+    <w:p>
+      <w:r>
+        <w:rPr>
+          <w:rFonts w:ascii="Consolas" w:hAnsi="Consolas"/>
+          <w:sz w:val="18"/>
+        </w:rPr>
+        <w:t>project(VERSION 0.5.0)</w:t>
+      </w:r>
+      <w:r>
+        <w:t xml:space="preserve"> → installer </w:t>
+      </w:r>
+      <w:r>
+        <w:rPr>
+          <w:rFonts w:ascii="Consolas" w:hAnsi="Consolas"/>
+          <w:sz w:val="18"/>
+        </w:rPr>
+        <w:t>.iss</w:t>
+      </w:r>
+      <w:r>
+        <w:t xml:space="preserve"> + README.</w:t>
+      </w:r>
+    </w:p>
+    <w:p>
+      <w:pPr>
+        <w:pStyle w:val="ListBullet"/>
+        <w:ind w:left="360"/>
+      </w:pPr>
+      <w:r>
+        <w:t xml:space="preserve">Installer </w:t>
+      </w:r>
+      <w:r>
+        <w:rPr>
+          <w:rFonts w:ascii="Consolas" w:hAnsi="Consolas"/>
+          <w:sz w:val="18"/>
+        </w:rPr>
+        <w:t>Excludes</w:t>
+      </w:r>
+      <w:r>
+        <w:t xml:space="preserve"> now drops </w:t>
+      </w:r>
+      <w:r>
+        <w:rPr>
+          <w:rFonts w:ascii="Consolas" w:hAnsi="Consolas"/>
+          <w:sz w:val="18"/>
+        </w:rPr>
+        <w:t>test_*.exe</w:t>
+      </w:r>
+      <w:r>
+        <w:t xml:space="preserve"> (release hygiene).</w:t>
       </w:r>
     </w:p>
     <w:p>
@@ -13061,7 +14519,7 @@
         <w:color w:val="808080"/>
         <w:sz w:val="16"/>
       </w:rPr>
-      <w:t>lyra-cpp — Session Log — auto-generated 2026-06-25 19:34 (source: SESSION_LOG.md)</w:t>
+      <w:t>lyra-cpp — Session Log — auto-generated 2026-06-29 09:38 (source: SESSION_LOG.md)</w:t>
     </w:r>
   </w:p>
 </w:hdr>

</xml_diff>

<commit_message>
docs: tooltips toggle + Profile picker — USER_GUIDE Visuals → Tooltips + SESSION_LOG; regen PDF/DOCX
USER_GUIDE: new "Tooltips" subsection in Visuals (global Show-tooltips
switch covering front panels + Settings dialog) + TOC entry.
SESSION_LOG: UI-cosmetics subsection under 2026-06-29 (tooltips toggle +
Profile picker tooltip/width). PDF + DOCX regen.

Co-Authored-By: Claude Opus 4.8 (1M context) <noreply@anthropic.com>
</commit_message>
<xml_diff>
--- a/docs/SESSION_LOG.docx
+++ b/docs/SESSION_LOG.docx
@@ -504,6 +504,114 @@
     <w:p>
       <w:r>
         <w:t>clean-chain note + Tuning-panel mirror + Dev→RX-BW); TX-BW + Lock bullets note the FM auto-width behaviour; Tuning-panel FM front-row bullets updated.</w:t>
+      </w:r>
+    </w:p>
+    <w:p>
+      <w:pPr>
+        <w:pStyle w:val="Heading3"/>
+      </w:pPr>
+      <w:r>
+        <w:t>UI cosmetics — global tooltips toggle + Profile picker (`ff0cdf9`)</w:t>
+      </w:r>
+    </w:p>
+    <w:p>
+      <w:pPr>
+        <w:pStyle w:val="ListBullet"/>
+        <w:ind w:left="360"/>
+      </w:pPr>
+      <w:r>
+        <w:rPr>
+          <w:b/>
+        </w:rPr>
+        <w:t>Global "Show tooltips" toggle</w:t>
+      </w:r>
+      <w:r>
+        <w:t xml:space="preserve"> (Settings → Visuals, default on,</w:t>
+      </w:r>
+    </w:p>
+    <w:p>
+      <w:r>
+        <w:t xml:space="preserve">persisted </w:t>
+      </w:r>
+      <w:r>
+        <w:rPr>
+          <w:rFonts w:ascii="Consolas" w:hAnsi="Consolas"/>
+          <w:sz w:val="18"/>
+        </w:rPr>
+        <w:t>ui/tooltips_enabled</w:t>
+      </w:r>
+      <w:r>
+        <w:t xml:space="preserve">). New </w:t>
+      </w:r>
+      <w:r>
+        <w:rPr>
+          <w:rFonts w:ascii="Consolas" w:hAnsi="Consolas"/>
+          <w:sz w:val="18"/>
+        </w:rPr>
+        <w:t>Prefs.tooltipsEnabled</w:t>
+      </w:r>
+      <w:r>
+        <w:t xml:space="preserve">; all 69 QML </w:t>
+      </w:r>
+      <w:r>
+        <w:rPr>
+          <w:rFonts w:ascii="Consolas" w:hAnsi="Consolas"/>
+          <w:sz w:val="18"/>
+        </w:rPr>
+        <w:t>ToolTip.visible</w:t>
+      </w:r>
+      <w:r>
+        <w:t xml:space="preserve"> bindings across 9 panels AND it in (swept), and an app-wide </w:t>
+      </w:r>
+      <w:r>
+        <w:rPr>
+          <w:rFonts w:ascii="Consolas" w:hAnsi="Consolas"/>
+          <w:sz w:val="18"/>
+        </w:rPr>
+        <w:t>QEvent::ToolTip</w:t>
+      </w:r>
+      <w:r>
+        <w:t xml:space="preserve"> event filter (</w:t>
+      </w:r>
+      <w:r>
+        <w:rPr>
+          <w:rFonts w:ascii="Consolas" w:hAnsi="Consolas"/>
+          <w:sz w:val="18"/>
+        </w:rPr>
+        <w:t>TooltipGate</w:t>
+      </w:r>
+      <w:r>
+        <w:t xml:space="preserve"> in mainwindow.cpp) swallows QWidget (Settings dialog / menu) tooltips too → one genuinely global switch. USER_GUIDE Visuals → Tooltips section added.</w:t>
+      </w:r>
+    </w:p>
+    <w:p>
+      <w:pPr>
+        <w:pStyle w:val="ListBullet"/>
+        <w:ind w:left="360"/>
+      </w:pPr>
+      <w:r>
+        <w:rPr>
+          <w:b/>
+        </w:rPr>
+        <w:t>Profile picker (ProfilePanel):</w:t>
+      </w:r>
+      <w:r>
+        <w:t xml:space="preserve"> the recall tooltip no longer pops over</w:t>
+      </w:r>
+    </w:p>
+    <w:p>
+      <w:r>
+        <w:t xml:space="preserve">the open dropdown (gated </w:t>
+      </w:r>
+      <w:r>
+        <w:rPr>
+          <w:rFonts w:ascii="Consolas" w:hAnsi="Consolas"/>
+          <w:sz w:val="18"/>
+        </w:rPr>
+        <w:t>!popup.visible</w:t>
+      </w:r>
+      <w:r>
+        <w:t>); combo width 300 → 170.</w:t>
       </w:r>
     </w:p>
     <w:p>
@@ -14519,7 +14627,7 @@
         <w:color w:val="808080"/>
         <w:sz w:val="16"/>
       </w:rPr>
-      <w:t>lyra-cpp — Session Log — auto-generated 2026-06-29 09:38 (source: SESSION_LOG.md)</w:t>
+      <w:t>lyra-cpp — Session Log — auto-generated 2026-06-29 09:59 (source: SESSION_LOG.md)</w:t>
     </w:r>
   </w:p>
 </w:hdr>

</xml_diff>

<commit_message>
docs: SESSION_LOG EOD entry — post-v0.7.0 docs + VAC latency posture
Logs the e199993 doc pass (Thetis plan FM entry + REMAINING_WORK) and the
dc9c4c2 operator-tunable VAC buffer/ring-latency feature (per-profile schema
v5, VarAC turnaround, ACCUMULATE on main). Regenerated PDF/DOCX.

Co-Authored-By: Claude Opus 4.8 (1M context) <noreply@anthropic.com>
</commit_message>
<xml_diff>
--- a/docs/SESSION_LOG.docx
+++ b/docs/SESSION_LOG.docx
@@ -13,6 +13,473 @@
     <w:p>
       <w:r>
         <w:t>Running EOD log. Newest entry on top. Short rough-outline format.</w:t>
+      </w:r>
+    </w:p>
+    <w:p>
+      <w:pPr>
+        <w:pBdr>
+          <w:bottom w:val="single" w:sz="6" w:color="808080"/>
+        </w:pBdr>
+      </w:pPr>
+    </w:p>
+    <w:p>
+      <w:pPr>
+        <w:pStyle w:val="Heading2"/>
+      </w:pPr>
+      <w:r>
+        <w:t>2026-06-29 (EOD) — Post-v0.7.0: docs + VAC latency posture (VarAC turnaround)</w:t>
+      </w:r>
+    </w:p>
+    <w:p>
+      <w:r>
+        <w:t xml:space="preserve">All on </w:t>
+      </w:r>
+      <w:r>
+        <w:rPr>
+          <w:rFonts w:ascii="Consolas" w:hAnsi="Consolas"/>
+          <w:sz w:val="18"/>
+        </w:rPr>
+        <w:t>main</w:t>
+      </w:r>
+      <w:r>
+        <w:t>, unreleased (after v0.7.0). A doc pass + one operator feature.</w:t>
+      </w:r>
+    </w:p>
+    <w:p>
+      <w:pPr>
+        <w:pStyle w:val="Heading3"/>
+      </w:pPr>
+      <w:r>
+        <w:t>Docs (`e199993`)</w:t>
+      </w:r>
+    </w:p>
+    <w:p>
+      <w:pPr>
+        <w:pStyle w:val="ListBullet"/>
+        <w:ind w:left="360"/>
+      </w:pPr>
+      <w:r>
+        <w:t xml:space="preserve">Recorded the v0.7.0 </w:t>
+      </w:r>
+      <w:r>
+        <w:rPr>
+          <w:b/>
+        </w:rPr>
+        <w:t>FM transmit refinements</w:t>
+      </w:r>
+      <w:r>
+        <w:t xml:space="preserve"> as a TX-relevant entry in</w:t>
+      </w:r>
+    </w:p>
+    <w:p>
+      <w:r>
+        <w:rPr>
+          <w:rFonts w:ascii="Consolas" w:hAnsi="Consolas"/>
+          <w:sz w:val="18"/>
+        </w:rPr>
+        <w:t>THETIS_DIRECT_PORT_PLAN.md</w:t>
+      </w:r>
+      <w:r>
+        <w:t xml:space="preserve">'s SHIPPED-WORK LOG (FM is a TX modulator concern): fix #2 AF brick-wall </w:t>
+      </w:r>
+      <w:r>
+        <w:rPr>
+          <w:rFonts w:ascii="Consolas" w:hAnsi="Consolas"/>
+          <w:sz w:val="18"/>
+        </w:rPr>
+        <w:t>b72bc50</w:t>
+      </w:r>
+      <w:r>
+        <w:t xml:space="preserve">, FM-aware bandwidth </w:t>
+      </w:r>
+      <w:r>
+        <w:rPr>
+          <w:rFonts w:ascii="Consolas" w:hAnsi="Consolas"/>
+          <w:sz w:val="18"/>
+        </w:rPr>
+        <w:t>4f32ca1</w:t>
+      </w:r>
+      <w:r>
+        <w:t xml:space="preserve">, pre-emphasis Off/Comm </w:t>
+      </w:r>
+      <w:r>
+        <w:rPr>
+          <w:rFonts w:ascii="Consolas" w:hAnsi="Consolas"/>
+          <w:sz w:val="18"/>
+        </w:rPr>
+        <w:t>a826c8c</w:t>
+      </w:r>
+      <w:r>
+        <w:t xml:space="preserve">, mic-rack auto-bypass </w:t>
+      </w:r>
+      <w:r>
+        <w:rPr>
+          <w:rFonts w:ascii="Consolas" w:hAnsi="Consolas"/>
+          <w:sz w:val="18"/>
+        </w:rPr>
+        <w:t>12c8991</w:t>
+      </w:r>
+      <w:r>
+        <w:t xml:space="preserve">, Tuning-panel pre-emph chip + Dev→RX-BW </w:t>
+      </w:r>
+      <w:r>
+        <w:rPr>
+          <w:rFonts w:ascii="Consolas" w:hAnsi="Consolas"/>
+          <w:sz w:val="18"/>
+        </w:rPr>
+        <w:t>67abf05</w:t>
+      </w:r>
+      <w:r>
+        <w:t>. RESUME POINTER + trailer refreshed to v0.7.0 (PureSignal + RX2/Split = remaining major TX-port arcs). Regen plan PDF/DOCX.</w:t>
+      </w:r>
+    </w:p>
+    <w:p>
+      <w:pPr>
+        <w:pStyle w:val="ListBullet"/>
+        <w:ind w:left="360"/>
+      </w:pPr>
+      <w:r>
+        <w:t xml:space="preserve">New </w:t>
+      </w:r>
+      <w:r>
+        <w:rPr>
+          <w:rFonts w:ascii="Consolas" w:hAnsi="Consolas"/>
+          <w:sz w:val="18"/>
+        </w:rPr>
+        <w:t>docs/REMAINING_WORK.md</w:t>
+      </w:r>
+      <w:r>
+        <w:t xml:space="preserve"> (+ PDF): standalone what's-left checklist — much</w:t>
+      </w:r>
+    </w:p>
+    <w:p>
+      <w:r>
+        <w:t>smaller now (two big arcs left, RX2/Split + PureSignal, plus TX/CW follow-ons). Cleaned two stale tasks (CW macros #176, Spots #182 — shipped).</w:t>
+      </w:r>
+    </w:p>
+    <w:p>
+      <w:pPr>
+        <w:pStyle w:val="Heading3"/>
+      </w:pPr>
+      <w:r>
+        <w:t>VAC latency posture — `dc9c4c2` (#158 follow-up, operator-bench-confirmed</w:t>
+      </w:r>
+    </w:p>
+    <w:p>
+      <w:pPr>
+        <w:pStyle w:val="Heading3"/>
+      </w:pPr>
+      <w:r>
+        <w:t>"works better for VarAC")</w:t>
+      </w:r>
+    </w:p>
+    <w:p>
+      <w:pPr>
+        <w:pStyle w:val="ListBullet"/>
+        <w:ind w:left="360"/>
+      </w:pPr>
+      <w:r>
+        <w:t>Operator wanted to squeeze VAC TX↔RX turnaround for VarAC/ARQ (runs 25 ms</w:t>
+      </w:r>
+    </w:p>
+    <w:p>
+      <w:r>
+        <w:t>rings in Thetis). The IVAC engine already ported the full latency surface (</w:t>
+      </w:r>
+      <w:r>
+        <w:rPr>
+          <w:rFonts w:ascii="Consolas" w:hAnsi="Consolas"/>
+          <w:sz w:val="18"/>
+        </w:rPr>
+        <w:t>SetIVACInLatency</w:t>
+      </w:r>
+      <w:r>
+        <w:t>/</w:t>
+      </w:r>
+      <w:r>
+        <w:rPr>
+          <w:rFonts w:ascii="Consolas" w:hAnsi="Consolas"/>
+          <w:sz w:val="18"/>
+        </w:rPr>
+        <w:t>OutLatency</w:t>
+      </w:r>
+      <w:r>
+        <w:t>/</w:t>
+      </w:r>
+      <w:r>
+        <w:rPr>
+          <w:rFonts w:ascii="Consolas" w:hAnsi="Consolas"/>
+          <w:sz w:val="18"/>
+        </w:rPr>
+        <w:t>PAInLatency</w:t>
+      </w:r>
+      <w:r>
+        <w:t>/</w:t>
+      </w:r>
+      <w:r>
+        <w:rPr>
+          <w:rFonts w:ascii="Consolas" w:hAnsi="Consolas"/>
+          <w:sz w:val="18"/>
+        </w:rPr>
+        <w:t>PAOutLatency</w:t>
+      </w:r>
+      <w:r>
+        <w:t xml:space="preserve"> + </w:t>
+      </w:r>
+      <w:r>
+        <w:rPr>
+          <w:rFonts w:ascii="Consolas" w:hAnsi="Consolas"/>
+          <w:sz w:val="18"/>
+        </w:rPr>
+        <w:t>vac_size</w:t>
+      </w:r>
+      <w:r>
+        <w:t xml:space="preserve">, driven by hardcoded </w:t>
+      </w:r>
+      <w:r>
+        <w:rPr>
+          <w:rFonts w:ascii="Consolas" w:hAnsi="Consolas"/>
+          <w:sz w:val="18"/>
+        </w:rPr>
+        <w:t>vac1LatencyMs_=120</w:t>
+      </w:r>
+      <w:r>
+        <w:t>/</w:t>
+      </w:r>
+      <w:r>
+        <w:rPr>
+          <w:rFonts w:ascii="Consolas" w:hAnsi="Consolas"/>
+          <w:sz w:val="18"/>
+        </w:rPr>
+        <w:t>vac1VacSize_=2048</w:t>
+      </w:r>
+      <w:r>
+        <w:t>); this exposed it.</w:t>
+      </w:r>
+    </w:p>
+    <w:p>
+      <w:pPr>
+        <w:pStyle w:val="ListBullet"/>
+        <w:ind w:left="360"/>
+      </w:pPr>
+      <w:r>
+        <w:rPr>
+          <w:b/>
+        </w:rPr>
+        <w:t>Settings → Audio → VAC1</w:t>
+      </w:r>
+      <w:r>
+        <w:t xml:space="preserve"> gains: </w:t>
+      </w:r>
+      <w:r>
+        <w:rPr>
+          <w:b/>
+        </w:rPr>
+        <w:t>Buffer size</w:t>
+      </w:r>
+      <w:r>
+        <w:t xml:space="preserve"> dropdown (128..8192, each</w:t>
+      </w:r>
+    </w:p>
+    <w:p>
+      <w:r>
+        <w:t xml:space="preserve">ms-labelled at 48 kHz), </w:t>
+      </w:r>
+      <w:r>
+        <w:rPr>
+          <w:b/>
+        </w:rPr>
+        <w:t>Latency</w:t>
+      </w:r>
+      <w:r>
+        <w:t xml:space="preserve"> spinbox (5..500 ms — rmatchV ring depth; one knob feeds all four reference latency fields), + a live </w:t>
+      </w:r>
+      <w:r>
+        <w:rPr>
+          <w:b/>
+        </w:rPr>
+        <w:t>Monitor</w:t>
+      </w:r>
+      <w:r>
+        <w:t xml:space="preserve"> line (ring fill % + overflow/underflow per direction, from </w:t>
+      </w:r>
+      <w:r>
+        <w:rPr>
+          <w:rFonts w:ascii="Consolas" w:hAnsi="Consolas"/>
+          <w:sz w:val="18"/>
+        </w:rPr>
+        <w:t>getIVACdiags</w:t>
+      </w:r>
+      <w:r>
+        <w:t xml:space="preserve"> on a 500 ms QTimer — the reference VAC1 Monitor). Drop latency until counters twitch, back off.</w:t>
+      </w:r>
+    </w:p>
+    <w:p>
+      <w:pPr>
+        <w:pStyle w:val="ListBullet"/>
+        <w:ind w:left="360"/>
+      </w:pPr>
+      <w:r>
+        <w:rPr>
+          <w:rFonts w:ascii="Consolas" w:hAnsi="Consolas"/>
+          <w:sz w:val="18"/>
+        </w:rPr>
+        <w:t>setVac1LatencyMs</w:t>
+      </w:r>
+      <w:r>
+        <w:t>/</w:t>
+      </w:r>
+      <w:r>
+        <w:rPr>
+          <w:rFonts w:ascii="Consolas" w:hAnsi="Consolas"/>
+          <w:sz w:val="18"/>
+        </w:rPr>
+        <w:t>setVac1VacSize</w:t>
+      </w:r>
+      <w:r>
+        <w:t xml:space="preserve"> persist (</w:t>
+      </w:r>
+      <w:r>
+        <w:rPr>
+          <w:rFonts w:ascii="Consolas" w:hAnsi="Consolas"/>
+          <w:sz w:val="18"/>
+        </w:rPr>
+        <w:t>vac1/latencyMs</w:t>
+      </w:r>
+      <w:r>
+        <w:t xml:space="preserve">, </w:t>
+      </w:r>
+      <w:r>
+        <w:rPr>
+          <w:rFonts w:ascii="Consolas" w:hAnsi="Consolas"/>
+          <w:sz w:val="18"/>
+        </w:rPr>
+        <w:t>vac1/vacSize</w:t>
+      </w:r>
+      <w:r>
+        <w:t>)</w:t>
+      </w:r>
+    </w:p>
+    <w:p>
+      <w:r>
+        <w:t xml:space="preserve">+ reopen VAC when live via the proven </w:t>
+      </w:r>
+      <w:r>
+        <w:rPr>
+          <w:rFonts w:ascii="Consolas" w:hAnsi="Consolas"/>
+          <w:sz w:val="18"/>
+        </w:rPr>
+        <w:t>rebuildVac1</w:t>
+      </w:r>
+      <w:r>
+        <w:t xml:space="preserve"> path; </w:t>
+      </w:r>
+      <w:r>
+        <w:rPr>
+          <w:rFonts w:ascii="Consolas" w:hAnsi="Consolas"/>
+          <w:sz w:val="18"/>
+        </w:rPr>
+        <w:t>vac1Diags()</w:t>
+      </w:r>
+      <w:r>
+        <w:t xml:space="preserve"> = guarded diag read.</w:t>
+      </w:r>
+    </w:p>
+    <w:p>
+      <w:pPr>
+        <w:pStyle w:val="ListBullet"/>
+        <w:ind w:left="360"/>
+      </w:pPr>
+      <w:r>
+        <w:rPr>
+          <w:b/>
+        </w:rPr>
+        <w:t>Carried per-profile (Profile schema v4→v5, tolerant-load):</w:t>
+      </w:r>
+      <w:r>
+        <w:t xml:space="preserve"> a tight VarAC</w:t>
+      </w:r>
+    </w:p>
+    <w:p>
+      <w:r>
+        <w:t>profile keeps low latency while SSB stays at 2048/120 — flip profiles, flip the whole VAC posture. USER_GUIDE "Latency (for fast ARQ modes like VarAC)" note added.</w:t>
+      </w:r>
+    </w:p>
+    <w:p>
+      <w:pPr>
+        <w:pStyle w:val="ListBullet"/>
+        <w:ind w:left="360"/>
+      </w:pPr>
+      <w:r>
+        <w:t xml:space="preserve">GOTCHA: reference </w:t>
+      </w:r>
+      <w:r>
+        <w:rPr>
+          <w:rFonts w:ascii="Consolas" w:hAnsi="Consolas"/>
+          <w:sz w:val="18"/>
+        </w:rPr>
+        <w:t>ivac.c:795</w:t>
+      </w:r>
+      <w:r>
+        <w:t xml:space="preserve"> type comment is REVERSED vs its code; the</w:t>
+      </w:r>
+    </w:p>
+    <w:p>
+      <w:r>
+        <w:t>TO/FROM VAC diag labels follow the code (</w:t>
+      </w:r>
+      <w:r>
+        <w:rPr>
+          <w:rFonts w:ascii="Consolas" w:hAnsi="Consolas"/>
+          <w:sz w:val="18"/>
+        </w:rPr>
+        <w:t>rmatchOUT</w:t>
+      </w:r>
+      <w:r>
+        <w:t xml:space="preserve">=TO type0 / </w:t>
+      </w:r>
+      <w:r>
+        <w:rPr>
+          <w:rFonts w:ascii="Consolas" w:hAnsi="Consolas"/>
+          <w:sz w:val="18"/>
+        </w:rPr>
+        <w:t>rmatchIN</w:t>
+      </w:r>
+      <w:r>
+        <w:t>=FROM type1, Ivac.cpp:797). Flag if they read backwards at bench.</w:t>
+      </w:r>
+    </w:p>
+    <w:p>
+      <w:pPr>
+        <w:pStyle w:val="ListBullet"/>
+        <w:ind w:left="360"/>
+      </w:pPr>
+      <w:r>
+        <w:t xml:space="preserve">Operator decision: </w:t>
+      </w:r>
+      <w:r>
+        <w:rPr>
+          <w:b/>
+        </w:rPr>
+        <w:t>ACCUMULATE</w:t>
+      </w:r>
+      <w:r>
+        <w:t xml:space="preserve"> — stays on </w:t>
+      </w:r>
+      <w:r>
+        <w:rPr>
+          <w:rFonts w:ascii="Consolas" w:hAnsi="Consolas"/>
+          <w:sz w:val="18"/>
+        </w:rPr>
+        <w:t>main</w:t>
+      </w:r>
+      <w:r>
+        <w:t xml:space="preserve"> unreleased; testers stay</w:t>
+      </w:r>
+    </w:p>
+    <w:p>
+      <w:r>
+        <w:t>on v0.7.0 until the next release bundles it.</w:t>
       </w:r>
     </w:p>
     <w:p>
@@ -14938,7 +15405,7 @@
         <w:color w:val="808080"/>
         <w:sz w:val="16"/>
       </w:rPr>
-      <w:t>lyra-cpp - Session Log — auto-generated 2026-06-29 17:45 (source: SESSION_LOG.md)</w:t>
+      <w:t>lyra-cpp - Session Log — auto-generated 2026-06-29 20:11 (source: SESSION_LOG.md)</w:t>
     </w:r>
   </w:p>
 </w:hdr>

</xml_diff>

<commit_message>
docs: capture two operator items for next session (Tuner trashcan + Solar-panel layout bug)
SESSION_LOG NEXT-SESSION block:
1. Tuner panel per-row delete → trashcan icon (TunerPanel.qml).
2. BUG: named layout save/recall re-adds the Solar (HamQSL) panel even when it
   wasn't open at save time — only the Solar panel so far; investigate the
   #184/v0.4.8 layout dock-visibility serialization.

Co-Authored-By: Claude Opus 4.8 (1M context) <noreply@anthropic.com>
</commit_message>
<xml_diff>
--- a/docs/SESSION_LOG.docx
+++ b/docs/SESSION_LOG.docx
@@ -480,6 +480,83 @@
     <w:p>
       <w:r>
         <w:t>on v0.7.0 until the next release bundles it.</w:t>
+      </w:r>
+    </w:p>
+    <w:p>
+      <w:pPr>
+        <w:pStyle w:val="Heading3"/>
+      </w:pPr>
+      <w:r>
+        <w:t>NEXT SESSION — operator-flagged (2026-06-29 EOD)</w:t>
+      </w:r>
+    </w:p>
+    <w:p>
+      <w:pPr>
+        <w:pStyle w:val="ListNumber"/>
+        <w:ind w:left="360"/>
+      </w:pPr>
+      <w:r>
+        <w:rPr>
+          <w:b/>
+        </w:rPr>
+        <w:t>Tuner panel delete → trashcan icon.</w:t>
+      </w:r>
+      <w:r>
+        <w:t xml:space="preserve"> Cosmetic: the per-row delete control</w:t>
+      </w:r>
+    </w:p>
+    <w:p>
+      <w:r>
+        <w:t xml:space="preserve">on the Tuner panel (currently the </w:t>
+      </w:r>
+      <w:r>
+        <w:rPr>
+          <w:rFonts w:ascii="Consolas" w:hAnsi="Consolas"/>
+          <w:sz w:val="18"/>
+        </w:rPr>
+        <w:t>−</w:t>
+      </w:r>
+      <w:r>
+        <w:t xml:space="preserve"> button, with the ✓/✗ confirm) should be a trashcan symbol. </w:t>
+      </w:r>
+      <w:r>
+        <w:rPr>
+          <w:rFonts w:ascii="Consolas" w:hAnsi="Consolas"/>
+          <w:sz w:val="18"/>
+        </w:rPr>
+        <w:t>src/qml/TunerPanel.qml</w:t>
+      </w:r>
+      <w:r>
+        <w:t>.</w:t>
+      </w:r>
+    </w:p>
+    <w:p>
+      <w:pPr>
+        <w:pStyle w:val="ListNumber"/>
+        <w:ind w:left="360"/>
+      </w:pPr>
+      <w:r>
+        <w:rPr>
+          <w:b/>
+        </w:rPr>
+        <w:t>BUG — layout save/recall re-adds the Solar panel.</w:t>
+      </w:r>
+      <w:r>
+        <w:t xml:space="preserve"> Saving a named panel</w:t>
+      </w:r>
+    </w:p>
+    <w:p>
+      <w:r>
+        <w:t xml:space="preserve">layout WITHOUT the Solar (HamQSL) panel open, then recalling it, ADDS the Solar panel even though it wasn't present at save time. </w:t>
+      </w:r>
+      <w:r>
+        <w:rPr>
+          <w:b/>
+        </w:rPr>
+        <w:t>Only the Solar panel shows this so far</w:t>
+      </w:r>
+      <w:r>
+        <w:t xml:space="preserve"> — other panels round-trip their hidden state fine. Smells like the Solar panel has a default-visible/auto-show that the layout-restore path doesn't suppress (cf. the Tuner base-dock "shows on summon" pattern from this session — a dock that buildDocks creates visible/auto and the saved hidden state doesn't override on restore). Investigate the named-layout save/restore (#184 / v0.4.8) dock-visibility serialization for the Solar/HamQSL panel specifically. See [[reference-hamqsl-solar]].</w:t>
       </w:r>
     </w:p>
     <w:p>
@@ -15405,7 +15482,7 @@
         <w:color w:val="808080"/>
         <w:sz w:val="16"/>
       </w:rPr>
-      <w:t>lyra-cpp - Session Log — auto-generated 2026-06-29 20:11 (source: SESSION_LOG.md)</w:t>
+      <w:t>lyra-cpp - Session Log — auto-generated 2026-06-29 20:50 (source: SESSION_LOG.md)</w:t>
     </w:r>
   </w:p>
 </w:hdr>

</xml_diff>

<commit_message>
docs: log USB-BCD safety bug for next session (intermittent C232HM detection + amp band-change in RX)
Operator-reported 2026-06-30. SESSION_LOG NEXT-SESSION item 3: FTDI C232HM BCD
adapter intermittently undetected (Windows sees COM1) + amp changed bands
during RX. Code-read root causes in src/usb_bcd.cpp (D2XX-vs-VCP coexistence +
empty-serial-on-open-handle blinding devices()). To fix on the operator bench;
spurious-BCD glitch tracked as a separate lower-confidence item. Full detail in
task #190 + the project_lyra_cpp_bcd memory note.

Co-Authored-By: Claude Opus 4.8 (1M context) <noreply@anthropic.com>
</commit_message>
<xml_diff>
--- a/docs/SESSION_LOG.docx
+++ b/docs/SESSION_LOG.docx
@@ -557,6 +557,40 @@
       </w:r>
       <w:r>
         <w:t xml:space="preserve"> — other panels round-trip their hidden state fine. Smells like the Solar panel has a default-visible/auto-show that the layout-restore path doesn't suppress (cf. the Tuner base-dock "shows on summon" pattern from this session — a dock that buildDocks creates visible/auto and the saved hidden state doesn't override on restore). Investigate the named-layout save/restore (#184 / v0.4.8) dock-visibility serialization for the Solar/HamQSL panel specifically. See [[reference-hamqsl-solar]].</w:t>
+      </w:r>
+    </w:p>
+    <w:p>
+      <w:pPr>
+        <w:pStyle w:val="ListNumber"/>
+        <w:ind w:left="360"/>
+      </w:pPr>
+      <w:r>
+        <w:t>**⚠ SAFETY BUG (task #190) — USB-BCD adapter intermittently undetected +</w:t>
+      </w:r>
+    </w:p>
+    <w:p>
+      <w:r>
+        <w:t xml:space="preserve">amp changed bands during RX.** FTDI C232HM (FT232H, COM1 in Windows) often not seen by Lyra's BCD dropdown; amp "beeped + changed bands in RX" (NOT RFI — heavily choked cable). Code-read root causes in </w:t>
+      </w:r>
+      <w:r>
+        <w:rPr>
+          <w:rFonts w:ascii="Consolas" w:hAnsi="Consolas"/>
+          <w:sz w:val="18"/>
+        </w:rPr>
+        <w:t>src/usb_bcd.cpp</w:t>
+      </w:r>
+      <w:r>
+        <w:t xml:space="preserve">: (a) enumeration is D2XX-only and the adapter is in VCP mode (owns the interface) → intermittent D2XX enumerate (the unplug/replug symptom); (b) </w:t>
+      </w:r>
+      <w:r>
+        <w:rPr>
+          <w:rFonts w:ascii="Consolas" w:hAnsi="Consolas"/>
+          <w:sz w:val="18"/>
+        </w:rPr>
+        <w:t>devices()</w:t>
+      </w:r>
+      <w:r>
+        <w:t xml:space="preserve"> (~103-114) filters empty serials, but FTDI returns an empty serial for any OPEN device and Lyra's ctor opens+holds the device when BCD is enabled → its own dropdown shows "(none)" (matches the screenshot). Fix on the operator's bench (verify-don't-guess; spurious-BCD glitch is a separate lower-confidence item — get a repro + logging first). Interim safety: untick "Enable USB-BCD amp band output". Full detail in the memory note + task #190.</w:t>
       </w:r>
     </w:p>
     <w:p>
@@ -15482,7 +15516,7 @@
         <w:color w:val="808080"/>
         <w:sz w:val="16"/>
       </w:rPr>
-      <w:t>lyra-cpp - Session Log — auto-generated 2026-06-29 20:50 (source: SESSION_LOG.md)</w:t>
+      <w:t>lyra-cpp - Session Log — auto-generated 2026-06-30 08:20 (source: SESSION_LOG.md)</w:t>
     </w:r>
   </w:p>
 </w:hdr>

</xml_diff>